<commit_message>
Ajustes na Documentação para o Estado Atual do TCC
</commit_message>
<xml_diff>
--- a/Documentação/Quarta Edição/TCC - Documentação.docx
+++ b/Documentação/Quarta Edição/TCC - Documentação.docx
@@ -3981,7 +3981,19 @@
         <w:rPr>
           <w:szCs w:val="24"/>
         </w:rPr>
-        <w:t>O único custo identificado no projeto refere-se à hospedagem em ambiente de produção. A aplicação é hospedada de forma unificada na plataforma Railway, onde o mesmo serviço em Node.js/Express entrega o front-</w:t>
+        <w:t>O único custo identificado no projeto refere-se</w:t>
+      </w:r>
+      <w:r>
+        <w:rPr>
+          <w:szCs w:val="24"/>
+        </w:rPr>
+        <w:t xml:space="preserve"> à hospedagem </w:t>
+      </w:r>
+      <w:r>
+        <w:rPr>
+          <w:szCs w:val="24"/>
+        </w:rPr>
+        <w:t>em ambiente de produção. A aplicação é hospedada de forma unificada na plataforma Railway, onde o mesmo serviço em Node.js/Express entrega o front-</w:t>
       </w:r>
       <w:proofErr w:type="spellStart"/>
       <w:r>
@@ -4280,16 +4292,37 @@
     <w:p>
       <w:pPr>
         <w:spacing w:line="360" w:lineRule="auto"/>
-        <w:rPr>
-          <w:szCs w:val="24"/>
-        </w:rPr>
-      </w:pPr>
-      <w:r>
-        <w:rPr>
-          <w:b/>
-          <w:bCs/>
-          <w:szCs w:val="24"/>
-        </w:rPr>
+        <w:ind w:firstLine="720"/>
+        <w:jc w:val="both"/>
+        <w:rPr>
+          <w:szCs w:val="24"/>
+        </w:rPr>
+      </w:pPr>
+    </w:p>
+    <w:p>
+      <w:pPr>
+        <w:spacing w:line="360" w:lineRule="auto"/>
+        <w:ind w:firstLine="720"/>
+        <w:jc w:val="both"/>
+        <w:rPr>
+          <w:szCs w:val="24"/>
+        </w:rPr>
+      </w:pPr>
+    </w:p>
+    <w:p>
+      <w:pPr>
+        <w:spacing w:line="360" w:lineRule="auto"/>
+        <w:rPr>
+          <w:szCs w:val="24"/>
+        </w:rPr>
+      </w:pPr>
+      <w:r>
+        <w:rPr>
+          <w:b/>
+          <w:bCs/>
+          <w:szCs w:val="24"/>
+        </w:rPr>
+        <w:lastRenderedPageBreak/>
         <w:t>7</w:t>
       </w:r>
       <w:r>
@@ -4356,7 +4389,6 @@
                 <w:bCs/>
                 <w:szCs w:val="24"/>
               </w:rPr>
-              <w:lastRenderedPageBreak/>
               <w:t>F1</w:t>
             </w:r>
           </w:p>
@@ -5289,6 +5321,7 @@
               <w:rPr>
                 <w:szCs w:val="24"/>
               </w:rPr>
+              <w:lastRenderedPageBreak/>
               <w:t>NF2.1 Validação de dados</w:t>
             </w:r>
           </w:p>
@@ -5354,7 +5387,6 @@
               <w:rPr>
                 <w:szCs w:val="24"/>
               </w:rPr>
-              <w:lastRenderedPageBreak/>
               <w:t>NF2.2 Integridade de dados</w:t>
             </w:r>
           </w:p>
@@ -6120,6 +6152,7 @@
                 <w:bCs/>
                 <w:szCs w:val="24"/>
               </w:rPr>
+              <w:lastRenderedPageBreak/>
               <w:t>F4</w:t>
             </w:r>
           </w:p>
@@ -6187,6 +6220,7 @@
                 <w:szCs w:val="24"/>
               </w:rPr>
             </w:pPr>
+            <w:proofErr w:type="gramStart"/>
             <w:r>
               <w:rPr>
                 <w:szCs w:val="24"/>
@@ -6197,7 +6231,14 @@
               <w:rPr>
                 <w:szCs w:val="24"/>
               </w:rPr>
-              <w:t xml:space="preserve"> registra a entrega de um EPI para um funcionário</w:t>
+              <w:t xml:space="preserve"> registra</w:t>
+            </w:r>
+            <w:proofErr w:type="gramEnd"/>
+            <w:r>
+              <w:rPr>
+                <w:szCs w:val="24"/>
+              </w:rPr>
+              <w:t xml:space="preserve"> a entrega de um EPI para um funcionário</w:t>
             </w:r>
           </w:p>
         </w:tc>
@@ -6223,7 +6264,6 @@
                 <w:bCs/>
                 <w:szCs w:val="24"/>
               </w:rPr>
-              <w:lastRenderedPageBreak/>
               <w:t>Pré-condição</w:t>
             </w:r>
           </w:p>
@@ -7152,6 +7192,7 @@
                 <w:bCs/>
                 <w:szCs w:val="24"/>
               </w:rPr>
+              <w:lastRenderedPageBreak/>
               <w:t>F6</w:t>
             </w:r>
           </w:p>
@@ -7197,7 +7238,6 @@
                 <w:bCs/>
                 <w:szCs w:val="24"/>
               </w:rPr>
-              <w:lastRenderedPageBreak/>
               <w:t>Descrição</w:t>
             </w:r>
           </w:p>
@@ -8051,7 +8091,14 @@
               <w:rPr>
                 <w:szCs w:val="24"/>
               </w:rPr>
-              <w:t>Os relatórios devem apresentar dados estruturados e legíveis</w:t>
+              <w:t xml:space="preserve">Os relatórios devem apresentar dados estruturados e </w:t>
+            </w:r>
+            <w:proofErr w:type="gramStart"/>
+            <w:r>
+              <w:rPr>
+                <w:szCs w:val="24"/>
+              </w:rPr>
+              <w:t>legíveis</w:t>
             </w:r>
             <w:r>
               <w:rPr>
@@ -8059,6 +8106,7 @@
               </w:rPr>
               <w:t xml:space="preserve"> .</w:t>
             </w:r>
+            <w:proofErr w:type="gramEnd"/>
           </w:p>
         </w:tc>
         <w:tc>
@@ -8142,7 +8190,6 @@
                 <w:bCs/>
                 <w:szCs w:val="24"/>
               </w:rPr>
-              <w:lastRenderedPageBreak/>
               <w:t>F8</w:t>
             </w:r>
           </w:p>
@@ -13918,133 +13965,13 @@
           <w:szCs w:val="24"/>
         </w:rPr>
       </w:pPr>
-    </w:p>
-    <w:p>
-      <w:pPr>
-        <w:spacing w:line="360" w:lineRule="auto"/>
-        <w:jc w:val="both"/>
-        <w:rPr>
-          <w:b/>
-          <w:bCs/>
-          <w:szCs w:val="24"/>
-        </w:rPr>
-      </w:pPr>
-    </w:p>
-    <w:p>
-      <w:pPr>
-        <w:spacing w:line="360" w:lineRule="auto"/>
-        <w:jc w:val="both"/>
-        <w:rPr>
-          <w:b/>
-          <w:bCs/>
-          <w:szCs w:val="24"/>
-        </w:rPr>
-      </w:pPr>
-    </w:p>
-    <w:p>
-      <w:pPr>
-        <w:spacing w:line="360" w:lineRule="auto"/>
-        <w:jc w:val="both"/>
-        <w:rPr>
-          <w:b/>
-          <w:bCs/>
-          <w:szCs w:val="24"/>
-        </w:rPr>
-      </w:pPr>
-    </w:p>
-    <w:p>
-      <w:pPr>
-        <w:spacing w:line="360" w:lineRule="auto"/>
-        <w:jc w:val="both"/>
-        <w:rPr>
-          <w:b/>
-          <w:bCs/>
-          <w:szCs w:val="24"/>
-        </w:rPr>
-      </w:pPr>
-    </w:p>
-    <w:p>
-      <w:pPr>
-        <w:spacing w:line="360" w:lineRule="auto"/>
-        <w:jc w:val="both"/>
-        <w:rPr>
-          <w:b/>
-          <w:bCs/>
-          <w:szCs w:val="24"/>
-        </w:rPr>
-      </w:pPr>
-    </w:p>
-    <w:p>
-      <w:pPr>
-        <w:spacing w:line="360" w:lineRule="auto"/>
-        <w:jc w:val="both"/>
-        <w:rPr>
-          <w:b/>
-          <w:bCs/>
-          <w:szCs w:val="24"/>
-        </w:rPr>
-      </w:pPr>
-    </w:p>
-    <w:p>
-      <w:pPr>
-        <w:spacing w:line="360" w:lineRule="auto"/>
-        <w:jc w:val="both"/>
-        <w:rPr>
-          <w:b/>
-          <w:bCs/>
-          <w:szCs w:val="24"/>
-        </w:rPr>
-      </w:pPr>
-    </w:p>
-    <w:p>
-      <w:pPr>
-        <w:spacing w:line="360" w:lineRule="auto"/>
-        <w:jc w:val="both"/>
-        <w:rPr>
-          <w:b/>
-          <w:bCs/>
-          <w:szCs w:val="24"/>
-        </w:rPr>
-      </w:pPr>
-    </w:p>
-    <w:p>
-      <w:pPr>
-        <w:spacing w:line="360" w:lineRule="auto"/>
-        <w:jc w:val="both"/>
-        <w:rPr>
-          <w:b/>
-          <w:bCs/>
-          <w:szCs w:val="24"/>
-        </w:rPr>
-      </w:pPr>
-    </w:p>
-    <w:p>
-      <w:pPr>
-        <w:spacing w:line="360" w:lineRule="auto"/>
-        <w:jc w:val="both"/>
-        <w:rPr>
-          <w:b/>
-          <w:bCs/>
-          <w:szCs w:val="24"/>
-        </w:rPr>
-      </w:pPr>
-    </w:p>
-    <w:p>
-      <w:pPr>
-        <w:spacing w:line="360" w:lineRule="auto"/>
-        <w:jc w:val="both"/>
-        <w:rPr>
-          <w:b/>
-          <w:bCs/>
-          <w:szCs w:val="24"/>
-        </w:rPr>
-      </w:pPr>
-      <w:r>
-        <w:rPr>
-          <w:b/>
-          <w:bCs/>
-          <w:szCs w:val="24"/>
-        </w:rPr>
+      <w:r>
+        <w:rPr>
+          <w:b/>
+          <w:bCs/>
+          <w:szCs w:val="24"/>
+        </w:rPr>
+        <w:lastRenderedPageBreak/>
         <w:t>9 TECNOLOGIAS ADOTADAS</w:t>
       </w:r>
     </w:p>
@@ -14331,33 +14258,123 @@
         <w:rPr>
           <w:szCs w:val="24"/>
         </w:rPr>
-        <w:t xml:space="preserve">Para o armazenamento dos dados, foi utilizado o MySQL, um sistema de gerenciamento de banco de dados relacional. Sua escolha se justificou pela </w:t>
-      </w:r>
-      <w:r>
-        <w:rPr>
+        <w:t>Para o armazenamento dos dados, foi utilizado o MySQL, um sistema de gerenciamento de banco de dados relacional. Sua escolha se justificou pela necessidade de manter a integridade referencial entre as tabelas do sistema, como a relação entre funcionários, EPIs e movimentações de estoque. O MySQL é uma tecnologia madura, amplamente adotada no mercado e com suporte nativo no ecossistema Node.js por meio de bibliotecas como o mysql2.</w:t>
+      </w:r>
+    </w:p>
+    <w:p>
+      <w:pPr>
+        <w:spacing w:line="360" w:lineRule="auto"/>
+        <w:jc w:val="both"/>
+        <w:rPr>
+          <w:b/>
+          <w:bCs/>
+          <w:szCs w:val="24"/>
+        </w:rPr>
+      </w:pPr>
+      <w:r>
+        <w:rPr>
+          <w:b/>
+          <w:bCs/>
+          <w:szCs w:val="24"/>
+        </w:rPr>
+        <w:t>Ferramentas de Desenvolvimento</w:t>
+      </w:r>
+    </w:p>
+    <w:p>
+      <w:pPr>
+        <w:spacing w:line="360" w:lineRule="auto"/>
+        <w:jc w:val="both"/>
+        <w:rPr>
+          <w:szCs w:val="24"/>
+        </w:rPr>
+      </w:pPr>
+      <w:r>
+        <w:rPr>
+          <w:szCs w:val="24"/>
+        </w:rPr>
+        <w:tab/>
+      </w:r>
+      <w:r>
+        <w:rPr>
+          <w:szCs w:val="24"/>
+        </w:rPr>
+        <w:t xml:space="preserve">Para o desenvolvimento do código, a equipe utilizou o Visual Studio </w:t>
+      </w:r>
+      <w:proofErr w:type="spellStart"/>
+      <w:r>
+        <w:rPr>
+          <w:szCs w:val="24"/>
+        </w:rPr>
+        <w:t>Code</w:t>
+      </w:r>
+      <w:proofErr w:type="spellEnd"/>
+      <w:r>
+        <w:rPr>
+          <w:szCs w:val="24"/>
+        </w:rPr>
+        <w:t xml:space="preserve">, editor gratuito e amplamente adotado na indústria. A prototipação das telas foi realizada no </w:t>
+      </w:r>
+      <w:proofErr w:type="spellStart"/>
+      <w:r>
+        <w:rPr>
+          <w:szCs w:val="24"/>
+        </w:rPr>
+        <w:t>Figma</w:t>
+      </w:r>
+      <w:proofErr w:type="spellEnd"/>
+      <w:r>
+        <w:rPr>
+          <w:szCs w:val="24"/>
+        </w:rPr>
+        <w:t xml:space="preserve">, que permitiu criar e validar as interfaces antes do desenvolvimento. Para os testes das rotas da API, foi utilizado o </w:t>
+      </w:r>
+      <w:proofErr w:type="spellStart"/>
+      <w:r>
+        <w:rPr>
+          <w:szCs w:val="24"/>
+        </w:rPr>
+        <w:t>Postman</w:t>
+      </w:r>
+      <w:proofErr w:type="spellEnd"/>
+      <w:r>
+        <w:rPr>
+          <w:szCs w:val="24"/>
+        </w:rPr>
+        <w:t xml:space="preserve">, ferramenta que facilita o envio de requisições HTTP e a verificação das respostas do servidor. O controle de versão do código foi feito com </w:t>
+      </w:r>
+      <w:proofErr w:type="spellStart"/>
+      <w:r>
+        <w:rPr>
+          <w:szCs w:val="24"/>
+        </w:rPr>
+        <w:t>Git</w:t>
+      </w:r>
+      <w:proofErr w:type="spellEnd"/>
+      <w:r>
+        <w:rPr>
+          <w:szCs w:val="24"/>
+        </w:rPr>
+        <w:t xml:space="preserve"> e GitHub.</w:t>
+      </w:r>
+    </w:p>
+    <w:p>
+      <w:pPr>
+        <w:spacing w:line="360" w:lineRule="auto"/>
+        <w:jc w:val="both"/>
+        <w:rPr>
+          <w:b/>
+          <w:bCs/>
+          <w:szCs w:val="24"/>
+        </w:rPr>
+      </w:pPr>
+      <w:r>
+        <w:rPr>
+          <w:b/>
+          <w:bCs/>
           <w:szCs w:val="24"/>
         </w:rPr>
         <w:lastRenderedPageBreak/>
-        <w:t>necessidade de manter a integridade referencial entre as tabelas do sistema, como a relação entre funcionários, EPIs e movimentações de estoque. O MySQL é uma tecnologia madura, amplamente adotada no mercado e com suporte nativo no ecossistema Node.js por meio de bibliotecas como o mysql2.</w:t>
-      </w:r>
-    </w:p>
-    <w:p>
-      <w:pPr>
-        <w:spacing w:line="360" w:lineRule="auto"/>
-        <w:jc w:val="both"/>
-        <w:rPr>
-          <w:b/>
-          <w:bCs/>
-          <w:szCs w:val="24"/>
-        </w:rPr>
-      </w:pPr>
-      <w:r>
-        <w:rPr>
-          <w:b/>
-          <w:bCs/>
-          <w:szCs w:val="24"/>
-        </w:rPr>
-        <w:t>Ferramentas de Desenvolvimento</w:t>
+        <w:t>Progressive Web App (PWA)</w:t>
       </w:r>
     </w:p>
     <w:p>
@@ -14378,388 +14395,374 @@
         <w:rPr>
           <w:szCs w:val="24"/>
         </w:rPr>
-        <w:t xml:space="preserve">Para o desenvolvimento do código, a equipe utilizou o Visual Studio </w:t>
+        <w:t xml:space="preserve">Após a conclusão da versão web, o sistema será adaptado para funcionar como um Progressive Web App. Essa abordagem permitirá que o SIGEPI seja instalado em dispositivos móveis como se fosse um aplicativo nativo, sem a necessidade de publicação em lojas como Google Play ou App Store. O PWA utiliza recursos como Service Workers e Web App </w:t>
       </w:r>
       <w:proofErr w:type="spellStart"/>
       <w:r>
         <w:rPr>
           <w:szCs w:val="24"/>
         </w:rPr>
-        <w:t>Code</w:t>
+        <w:t>Manifest</w:t>
       </w:r>
       <w:proofErr w:type="spellEnd"/>
       <w:r>
         <w:rPr>
           <w:szCs w:val="24"/>
         </w:rPr>
-        <w:t xml:space="preserve">, editor gratuito e amplamente adotado na indústria. A prototipação das telas foi realizada no </w:t>
+        <w:t xml:space="preserve"> para oferecer uma experiência próxima à de um aplicativo móvel, mantendo a mesma base de código da versão web.</w:t>
+      </w:r>
+    </w:p>
+    <w:p>
+      <w:pPr>
+        <w:spacing w:line="360" w:lineRule="auto"/>
+        <w:jc w:val="both"/>
+        <w:rPr>
+          <w:b/>
+          <w:bCs/>
+          <w:szCs w:val="24"/>
+        </w:rPr>
+      </w:pPr>
+      <w:r>
+        <w:rPr>
+          <w:b/>
+          <w:bCs/>
+          <w:szCs w:val="24"/>
+        </w:rPr>
+        <w:t>Hospedagem</w:t>
+      </w:r>
+    </w:p>
+    <w:p>
+      <w:pPr>
+        <w:spacing w:line="360" w:lineRule="auto"/>
+        <w:jc w:val="both"/>
+        <w:rPr>
+          <w:b/>
+          <w:bCs/>
+          <w:szCs w:val="24"/>
+        </w:rPr>
+      </w:pPr>
+      <w:r>
+        <w:rPr>
+          <w:b/>
+          <w:bCs/>
+          <w:szCs w:val="24"/>
+        </w:rPr>
+        <w:tab/>
+      </w:r>
+      <w:r>
+        <w:rPr>
+          <w:szCs w:val="24"/>
+        </w:rPr>
+        <w:t>Para a disponibilização do sistema em ambiente de produção, adotou-se uma arquitetura de hospedagem dividida. O front-</w:t>
       </w:r>
       <w:proofErr w:type="spellStart"/>
       <w:r>
         <w:rPr>
           <w:szCs w:val="24"/>
         </w:rPr>
-        <w:t>Figma</w:t>
+        <w:t>end</w:t>
       </w:r>
       <w:proofErr w:type="spellEnd"/>
       <w:r>
         <w:rPr>
           <w:szCs w:val="24"/>
         </w:rPr>
-        <w:t xml:space="preserve">, que permitiu criar e validar as interfaces antes do desenvolvimento. Para os testes das rotas da API, foi utilizado o </w:t>
+        <w:t xml:space="preserve">, composto por arquivos estáticos, foi publicado em plataforma de hospedagem de sites estáticos com certificado HTTPS automático. O </w:t>
       </w:r>
       <w:proofErr w:type="spellStart"/>
       <w:r>
         <w:rPr>
           <w:szCs w:val="24"/>
         </w:rPr>
-        <w:t>Postman</w:t>
+        <w:t>back-end</w:t>
       </w:r>
       <w:proofErr w:type="spellEnd"/>
       <w:r>
         <w:rPr>
           <w:szCs w:val="24"/>
         </w:rPr>
-        <w:t xml:space="preserve">, ferramenta que facilita o envio de requisições HTTP e a verificação das respostas do servidor. O controle de versão do código foi feito com </w:t>
+        <w:t>, desenvolvido em Node.js, e o banco de dados MySQL foram hospedados em plataforma de aplicações que mantém o servidor em execução contínua, permitindo o acesso à API a qualquer momento. A adoção de HTTPS não é apenas uma exigência de segurança para o tráfego de credenciais: é também requisito técnico para o funcionamento do Progressive Web App, uma vez que os navegadores só permitem o registro de Service Workers em conexões seguras.</w:t>
+      </w:r>
+    </w:p>
+    <w:p>
+      <w:pPr>
+        <w:spacing w:line="360" w:lineRule="auto"/>
+        <w:jc w:val="both"/>
+        <w:rPr>
+          <w:szCs w:val="24"/>
+        </w:rPr>
+      </w:pPr>
+    </w:p>
+    <w:p>
+      <w:pPr>
+        <w:spacing w:line="360" w:lineRule="auto"/>
+        <w:jc w:val="both"/>
+        <w:rPr>
+          <w:szCs w:val="24"/>
+        </w:rPr>
+      </w:pPr>
+    </w:p>
+    <w:p>
+      <w:pPr>
+        <w:spacing w:line="360" w:lineRule="auto"/>
+        <w:jc w:val="both"/>
+        <w:rPr>
+          <w:szCs w:val="24"/>
+        </w:rPr>
+      </w:pPr>
+    </w:p>
+    <w:p>
+      <w:pPr>
+        <w:spacing w:line="360" w:lineRule="auto"/>
+        <w:jc w:val="both"/>
+        <w:rPr>
+          <w:szCs w:val="24"/>
+        </w:rPr>
+      </w:pPr>
+    </w:p>
+    <w:p>
+      <w:pPr>
+        <w:spacing w:line="360" w:lineRule="auto"/>
+        <w:jc w:val="both"/>
+        <w:rPr>
+          <w:szCs w:val="24"/>
+        </w:rPr>
+      </w:pPr>
+    </w:p>
+    <w:p>
+      <w:pPr>
+        <w:spacing w:line="360" w:lineRule="auto"/>
+        <w:jc w:val="both"/>
+        <w:rPr>
+          <w:szCs w:val="24"/>
+        </w:rPr>
+      </w:pPr>
+    </w:p>
+    <w:p>
+      <w:pPr>
+        <w:spacing w:line="360" w:lineRule="auto"/>
+        <w:jc w:val="both"/>
+        <w:rPr>
+          <w:szCs w:val="24"/>
+        </w:rPr>
+      </w:pPr>
+    </w:p>
+    <w:p>
+      <w:pPr>
+        <w:spacing w:line="360" w:lineRule="auto"/>
+        <w:jc w:val="both"/>
+        <w:rPr>
+          <w:szCs w:val="24"/>
+        </w:rPr>
+      </w:pPr>
+    </w:p>
+    <w:p>
+      <w:pPr>
+        <w:spacing w:line="360" w:lineRule="auto"/>
+        <w:jc w:val="both"/>
+        <w:rPr>
+          <w:szCs w:val="24"/>
+        </w:rPr>
+      </w:pPr>
+    </w:p>
+    <w:p>
+      <w:pPr>
+        <w:spacing w:line="360" w:lineRule="auto"/>
+        <w:jc w:val="both"/>
+        <w:rPr>
+          <w:szCs w:val="24"/>
+        </w:rPr>
+      </w:pPr>
+    </w:p>
+    <w:p>
+      <w:pPr>
+        <w:spacing w:line="360" w:lineRule="auto"/>
+        <w:jc w:val="both"/>
+        <w:rPr>
+          <w:szCs w:val="24"/>
+        </w:rPr>
+      </w:pPr>
+    </w:p>
+    <w:p>
+      <w:pPr>
+        <w:spacing w:line="360" w:lineRule="auto"/>
+        <w:jc w:val="both"/>
+        <w:rPr>
+          <w:szCs w:val="24"/>
+        </w:rPr>
+      </w:pPr>
+    </w:p>
+    <w:p>
+      <w:pPr>
+        <w:spacing w:line="360" w:lineRule="auto"/>
+        <w:jc w:val="both"/>
+        <w:rPr>
+          <w:szCs w:val="24"/>
+        </w:rPr>
+      </w:pPr>
+    </w:p>
+    <w:p>
+      <w:pPr>
+        <w:spacing w:line="360" w:lineRule="auto"/>
+        <w:jc w:val="both"/>
+        <w:rPr>
+          <w:szCs w:val="24"/>
+        </w:rPr>
+      </w:pPr>
+    </w:p>
+    <w:p>
+      <w:pPr>
+        <w:spacing w:line="360" w:lineRule="auto"/>
+        <w:jc w:val="both"/>
+        <w:rPr>
+          <w:szCs w:val="24"/>
+        </w:rPr>
+      </w:pPr>
+    </w:p>
+    <w:p>
+      <w:pPr>
+        <w:spacing w:line="360" w:lineRule="auto"/>
+        <w:jc w:val="both"/>
+        <w:rPr>
+          <w:szCs w:val="24"/>
+        </w:rPr>
+      </w:pPr>
+    </w:p>
+    <w:p>
+      <w:pPr>
+        <w:spacing w:line="360" w:lineRule="auto"/>
+        <w:jc w:val="both"/>
+        <w:rPr>
+          <w:b/>
+          <w:bCs/>
+          <w:szCs w:val="24"/>
+        </w:rPr>
+      </w:pPr>
+    </w:p>
+    <w:p>
+      <w:pPr>
+        <w:spacing w:line="360" w:lineRule="auto"/>
+        <w:jc w:val="both"/>
+        <w:rPr>
+          <w:b/>
+          <w:bCs/>
+          <w:szCs w:val="24"/>
+        </w:rPr>
+      </w:pPr>
+      <w:r>
+        <w:rPr>
+          <w:b/>
+          <w:bCs/>
+          <w:szCs w:val="24"/>
+        </w:rPr>
+        <w:lastRenderedPageBreak/>
+        <w:t>10 MODELO DO BANCO DE DADOS</w:t>
+      </w:r>
+    </w:p>
+    <w:p>
+      <w:pPr>
+        <w:spacing w:line="360" w:lineRule="auto"/>
+        <w:jc w:val="both"/>
+        <w:rPr>
+          <w:szCs w:val="24"/>
+        </w:rPr>
+      </w:pPr>
+      <w:r>
+        <w:rPr>
+          <w:szCs w:val="24"/>
+        </w:rPr>
+        <w:tab/>
+      </w:r>
+      <w:r>
+        <w:rPr>
+          <w:szCs w:val="24"/>
+        </w:rPr>
+        <w:t>O banco de dados do SIGEPI foi projetado seguindo o modelo relacional e implementado em MySQL. O objetivo da modelagem foi garantir a integridade dos dados, a rastreabilidade das movimentações e o suporte eficiente às consultas realizadas pelo sistema. Um cuidado adotado em todo o modelo foi o uso do tipo ENUM nos campos de status e de tipo (situação de usuários, funcionários, EPIs, empresas, solicitações e entregas), que restringe os valores aceitos apenas aos previamente definidos, impedindo o registro de informações inválidas diretamente no banco — uma camada adicional de segurança e integridade.</w:t>
+      </w:r>
+    </w:p>
+    <w:p>
+      <w:pPr>
+        <w:spacing w:line="360" w:lineRule="auto"/>
+        <w:ind w:firstLine="720"/>
+        <w:jc w:val="both"/>
+        <w:rPr>
+          <w:szCs w:val="24"/>
+        </w:rPr>
+      </w:pPr>
+      <w:r>
+        <w:rPr>
+          <w:szCs w:val="24"/>
+        </w:rPr>
+        <w:t>As principais entidades do banco de dados são: empresas, usuários, funcionários, setores, EPIs, estoque, movimentações de estoque, entregas, solicitações e logs de auditoria. Somam-se a elas tabelas auxiliares de apoio — cidade, endereço, categoria, tipo de usuário e o vínculo N:N entre EPIs e setores —, totalizando quinze tabelas. Cada entidade é representada por uma tabela, e os relacionamentos entre elas são estabelecidos por meio de chaves primárias e estrangeiras.</w:t>
+      </w:r>
+    </w:p>
+    <w:p>
+      <w:pPr>
+        <w:spacing w:line="360" w:lineRule="auto"/>
+        <w:ind w:firstLine="720"/>
+        <w:jc w:val="both"/>
+        <w:rPr>
+          <w:szCs w:val="24"/>
+        </w:rPr>
+      </w:pPr>
+      <w:r>
+        <w:rPr>
+          <w:szCs w:val="24"/>
+        </w:rPr>
+        <w:t>A tabela de empresas é o ponto central do modelo, pois todos os dados cadastrados no sistema pertencem a uma empresa específica. Isso permite que o SIGEPI seja utilizado por múltiplas empresas de forma isolada, sem que os dados de uma organização sejam visíveis para outra. A empresa possui ainda um código de acesso único, gerado automaticamente, utilizado pelos funcionários para se vincularem a ela.</w:t>
+      </w:r>
+    </w:p>
+    <w:p>
+      <w:pPr>
+        <w:spacing w:line="360" w:lineRule="auto"/>
+        <w:ind w:firstLine="720"/>
+        <w:jc w:val="both"/>
+        <w:rPr>
+          <w:szCs w:val="24"/>
+        </w:rPr>
+      </w:pPr>
+      <w:r>
+        <w:rPr>
+          <w:szCs w:val="24"/>
+        </w:rPr>
+        <w:t>A tabela de usuários armazena os dados de acesso — nome, e-mail, CPF, data de nascimento, senha criptografada e situação — e associa cada usuário a um perfil (administrador ou funcionário) por meio da tabela de tipos de usuário. O vínculo do usuário com uma empresa é opcional no momento do cadastro, o que permite que a conta exista antes de o usuário criar uma empresa (administrador) ou entrar em uma (funcionário, mediante o código de acesso). A tabela de funcionários complementa esses dados com nome, data de nascimento, setor de atuação e situação; quando um funcionário é inativado, o sistema registra também o motivo e a data da inativação, preservando o histórico por meio de exclusão lógica, sem apagar o registro.</w:t>
+      </w:r>
+    </w:p>
+    <w:p>
+      <w:pPr>
+        <w:spacing w:line="360" w:lineRule="auto"/>
+        <w:ind w:firstLine="720"/>
+        <w:jc w:val="both"/>
+        <w:rPr>
+          <w:szCs w:val="24"/>
+        </w:rPr>
+      </w:pPr>
+      <w:r>
+        <w:rPr>
+          <w:szCs w:val="24"/>
+        </w:rPr>
+        <w:t xml:space="preserve">Os EPIs são cadastrados em uma tabela própria, que contém nome, descrição, número e validade do Certificado de Aprovação (CA) e a categoria do equipamento. As categorias não são criadas pelo usuário: correspondem às oito categorias de </w:t>
+      </w:r>
+      <w:r>
+        <w:rPr>
+          <w:szCs w:val="24"/>
+        </w:rPr>
+        <w:lastRenderedPageBreak/>
+        <w:t>proteção previstas na NR-6, inseridas previamente no banco. A validade do CA (</w:t>
       </w:r>
       <w:proofErr w:type="spellStart"/>
       <w:r>
         <w:rPr>
           <w:szCs w:val="24"/>
         </w:rPr>
-        <w:t>Git</w:t>
+        <w:t>dt_validade_ca</w:t>
       </w:r>
       <w:proofErr w:type="spellEnd"/>
       <w:r>
         <w:rPr>
           <w:szCs w:val="24"/>
         </w:rPr>
-        <w:t xml:space="preserve"> e GitHub.</w:t>
-      </w:r>
-    </w:p>
-    <w:p>
-      <w:pPr>
-        <w:spacing w:line="360" w:lineRule="auto"/>
-        <w:jc w:val="both"/>
-        <w:rPr>
-          <w:b/>
-          <w:bCs/>
-          <w:szCs w:val="24"/>
-        </w:rPr>
-      </w:pPr>
-      <w:r>
-        <w:rPr>
-          <w:b/>
-          <w:bCs/>
-          <w:szCs w:val="24"/>
-        </w:rPr>
-        <w:t>Progressive Web App (PWA)</w:t>
-      </w:r>
-    </w:p>
-    <w:p>
-      <w:pPr>
-        <w:spacing w:line="360" w:lineRule="auto"/>
-        <w:jc w:val="both"/>
-        <w:rPr>
-          <w:szCs w:val="24"/>
-        </w:rPr>
-      </w:pPr>
-      <w:r>
-        <w:rPr>
-          <w:szCs w:val="24"/>
-        </w:rPr>
-        <w:tab/>
-      </w:r>
-      <w:r>
-        <w:rPr>
-          <w:szCs w:val="24"/>
-        </w:rPr>
-        <w:t xml:space="preserve">Após a conclusão da versão web, o sistema será adaptado para funcionar como um Progressive Web App. Essa abordagem permitirá que o SIGEPI seja instalado em dispositivos móveis como se fosse um aplicativo nativo, sem a necessidade de publicação em lojas como Google Play ou App Store. O PWA utiliza recursos como Service Workers e Web App </w:t>
-      </w:r>
-      <w:proofErr w:type="spellStart"/>
-      <w:r>
-        <w:rPr>
-          <w:szCs w:val="24"/>
-        </w:rPr>
-        <w:t>Manifest</w:t>
-      </w:r>
-      <w:proofErr w:type="spellEnd"/>
-      <w:r>
-        <w:rPr>
-          <w:szCs w:val="24"/>
-        </w:rPr>
-        <w:t xml:space="preserve"> para oferecer uma experiência próxima à de um aplicativo móvel, mantendo a mesma base de código da versão web.</w:t>
-      </w:r>
-    </w:p>
-    <w:p>
-      <w:pPr>
-        <w:spacing w:line="360" w:lineRule="auto"/>
-        <w:jc w:val="both"/>
-        <w:rPr>
-          <w:b/>
-          <w:bCs/>
-          <w:szCs w:val="24"/>
-        </w:rPr>
-      </w:pPr>
-      <w:r>
-        <w:rPr>
-          <w:b/>
-          <w:bCs/>
-          <w:szCs w:val="24"/>
-        </w:rPr>
-        <w:t>Hospedagem</w:t>
-      </w:r>
-    </w:p>
-    <w:p>
-      <w:pPr>
-        <w:spacing w:line="360" w:lineRule="auto"/>
-        <w:jc w:val="both"/>
-        <w:rPr>
-          <w:b/>
-          <w:bCs/>
-          <w:szCs w:val="24"/>
-        </w:rPr>
-      </w:pPr>
-      <w:r>
-        <w:rPr>
-          <w:b/>
-          <w:bCs/>
-          <w:szCs w:val="24"/>
-        </w:rPr>
-        <w:tab/>
-      </w:r>
-      <w:r>
-        <w:rPr>
-          <w:szCs w:val="24"/>
-        </w:rPr>
-        <w:t>Para a disponibilização do sistema em ambiente de produção, adotou-se uma arquitetura de hospedagem dividida. O front-</w:t>
-      </w:r>
-      <w:proofErr w:type="spellStart"/>
-      <w:r>
-        <w:rPr>
-          <w:szCs w:val="24"/>
-        </w:rPr>
-        <w:t>end</w:t>
-      </w:r>
-      <w:proofErr w:type="spellEnd"/>
-      <w:r>
-        <w:rPr>
-          <w:szCs w:val="24"/>
-        </w:rPr>
-        <w:t xml:space="preserve">, composto por arquivos estáticos, foi publicado em plataforma de hospedagem de sites estáticos com certificado HTTPS automático. O </w:t>
-      </w:r>
-      <w:proofErr w:type="spellStart"/>
-      <w:r>
-        <w:rPr>
-          <w:szCs w:val="24"/>
-        </w:rPr>
-        <w:t>back-end</w:t>
-      </w:r>
-      <w:proofErr w:type="spellEnd"/>
-      <w:r>
-        <w:rPr>
-          <w:szCs w:val="24"/>
-        </w:rPr>
-        <w:t>, desenvolvido em Node.js, e o banco de dados MySQL foram hospedados em plataforma de aplicações que mantém o servidor em execução contínua, permitindo o acesso à API a qualquer momento. A adoção de HTTPS não é apenas uma exigência de segurança para o tráfego de credenciais: é também requisito técnico para o funcionamento do Progressive Web App, uma vez que os navegadores só permitem o registro de Service Workers em conexões seguras.</w:t>
-      </w:r>
-    </w:p>
-    <w:p>
-      <w:pPr>
-        <w:spacing w:line="360" w:lineRule="auto"/>
-        <w:jc w:val="both"/>
-        <w:rPr>
-          <w:szCs w:val="24"/>
-        </w:rPr>
-      </w:pPr>
-    </w:p>
-    <w:p>
-      <w:pPr>
-        <w:spacing w:line="360" w:lineRule="auto"/>
-        <w:jc w:val="both"/>
-        <w:rPr>
-          <w:szCs w:val="24"/>
-        </w:rPr>
-      </w:pPr>
-    </w:p>
-    <w:p>
-      <w:pPr>
-        <w:spacing w:line="360" w:lineRule="auto"/>
-        <w:jc w:val="both"/>
-        <w:rPr>
-          <w:szCs w:val="24"/>
-        </w:rPr>
-      </w:pPr>
-    </w:p>
-    <w:p>
-      <w:pPr>
-        <w:spacing w:line="360" w:lineRule="auto"/>
-        <w:jc w:val="both"/>
-        <w:rPr>
-          <w:szCs w:val="24"/>
-        </w:rPr>
-      </w:pPr>
-    </w:p>
-    <w:p>
-      <w:pPr>
-        <w:spacing w:line="360" w:lineRule="auto"/>
-        <w:jc w:val="both"/>
-        <w:rPr>
-          <w:szCs w:val="24"/>
-        </w:rPr>
-      </w:pPr>
-    </w:p>
-    <w:p>
-      <w:pPr>
-        <w:spacing w:line="360" w:lineRule="auto"/>
-        <w:jc w:val="both"/>
-        <w:rPr>
-          <w:szCs w:val="24"/>
-        </w:rPr>
-      </w:pPr>
-    </w:p>
-    <w:p>
-      <w:pPr>
-        <w:spacing w:line="360" w:lineRule="auto"/>
-        <w:jc w:val="both"/>
-        <w:rPr>
-          <w:szCs w:val="24"/>
-        </w:rPr>
-      </w:pPr>
-    </w:p>
-    <w:p>
-      <w:pPr>
-        <w:spacing w:line="360" w:lineRule="auto"/>
-        <w:jc w:val="both"/>
-        <w:rPr>
-          <w:szCs w:val="24"/>
-        </w:rPr>
-      </w:pPr>
-    </w:p>
-    <w:p>
-      <w:pPr>
-        <w:spacing w:line="360" w:lineRule="auto"/>
-        <w:jc w:val="both"/>
-        <w:rPr>
-          <w:szCs w:val="24"/>
-        </w:rPr>
-      </w:pPr>
-    </w:p>
-    <w:p>
-      <w:pPr>
-        <w:spacing w:line="360" w:lineRule="auto"/>
-        <w:jc w:val="both"/>
-        <w:rPr>
-          <w:szCs w:val="24"/>
-        </w:rPr>
-      </w:pPr>
-    </w:p>
-    <w:p>
-      <w:pPr>
-        <w:spacing w:line="360" w:lineRule="auto"/>
-        <w:jc w:val="both"/>
-        <w:rPr>
-          <w:szCs w:val="24"/>
-        </w:rPr>
-      </w:pPr>
-    </w:p>
-    <w:p>
-      <w:pPr>
-        <w:spacing w:line="360" w:lineRule="auto"/>
-        <w:jc w:val="both"/>
-        <w:rPr>
-          <w:szCs w:val="24"/>
-        </w:rPr>
-      </w:pPr>
-    </w:p>
-    <w:p>
-      <w:pPr>
-        <w:spacing w:line="360" w:lineRule="auto"/>
-        <w:jc w:val="both"/>
-        <w:rPr>
-          <w:szCs w:val="24"/>
-        </w:rPr>
-      </w:pPr>
-    </w:p>
-    <w:p>
-      <w:pPr>
-        <w:spacing w:line="360" w:lineRule="auto"/>
-        <w:jc w:val="both"/>
-        <w:rPr>
-          <w:szCs w:val="24"/>
-        </w:rPr>
-      </w:pPr>
-    </w:p>
-    <w:p>
-      <w:pPr>
-        <w:spacing w:line="360" w:lineRule="auto"/>
-        <w:jc w:val="both"/>
-        <w:rPr>
-          <w:b/>
-          <w:bCs/>
-          <w:szCs w:val="24"/>
-        </w:rPr>
-      </w:pPr>
-    </w:p>
-    <w:p>
-      <w:pPr>
-        <w:spacing w:line="360" w:lineRule="auto"/>
-        <w:jc w:val="both"/>
-        <w:rPr>
-          <w:b/>
-          <w:bCs/>
-          <w:szCs w:val="24"/>
-        </w:rPr>
-      </w:pPr>
-    </w:p>
-    <w:p>
-      <w:pPr>
-        <w:spacing w:line="360" w:lineRule="auto"/>
-        <w:jc w:val="both"/>
-        <w:rPr>
-          <w:b/>
-          <w:bCs/>
-          <w:szCs w:val="24"/>
-        </w:rPr>
-      </w:pPr>
-    </w:p>
-    <w:p>
-      <w:pPr>
-        <w:spacing w:line="360" w:lineRule="auto"/>
-        <w:jc w:val="both"/>
-        <w:rPr>
-          <w:b/>
-          <w:bCs/>
-          <w:szCs w:val="24"/>
-        </w:rPr>
-      </w:pPr>
-      <w:r>
-        <w:rPr>
-          <w:b/>
-          <w:bCs/>
-          <w:szCs w:val="24"/>
-        </w:rPr>
-        <w:t>10 MODELO DO BANCO DE DADOS</w:t>
-      </w:r>
-    </w:p>
-    <w:p>
-      <w:pPr>
-        <w:spacing w:line="360" w:lineRule="auto"/>
-        <w:jc w:val="both"/>
-        <w:rPr>
-          <w:szCs w:val="24"/>
-        </w:rPr>
-      </w:pPr>
-      <w:r>
-        <w:rPr>
-          <w:szCs w:val="24"/>
-        </w:rPr>
-        <w:tab/>
-      </w:r>
-      <w:r>
-        <w:rPr>
-          <w:szCs w:val="24"/>
-        </w:rPr>
-        <w:t>O banco de dados do SIGEPI foi projetado seguindo o modelo relacional e implementado em MySQL. O objetivo da modelagem foi garantir a integridade dos dados, a rastreabilidade das movimentações e o suporte eficiente às consultas realizadas pelo sistema. Um cuidado adotado em todo o modelo foi o uso do tipo ENUM nos campos de status e de tipo (situação de usuários, funcionários, EPIs, empresas, solicitações e entregas), que restringe os valores aceitos apenas aos previamente definidos, impedindo o registro de informações inválidas diretamente no banco — uma camada adicional de segurança e integridade.</w:t>
+        <w:t>) é o campo que alimenta o cálculo de situação dos EPIs — regular, próximo do vencimento ou vencido — exibido nos filtros e no painel de dashboard.</w:t>
       </w:r>
     </w:p>
     <w:p>
@@ -14775,7 +14778,7 @@
         <w:rPr>
           <w:szCs w:val="24"/>
         </w:rPr>
-        <w:t>As principais entidades do banco de dados são: empresas, usuários, funcionários, setores, EPIs, estoque, movimentações de estoque, entregas, solicitações e logs de auditoria. Somam-se a elas tabelas auxiliares de apoio — cidade, endereço, categoria, tipo de usuário e o vínculo N:N entre EPIs e setores —, totalizando quinze tabelas. Cada entidade é representada por uma tabela, e os relacionamentos entre elas são estabelecidos por meio de chaves primárias e estrangeiras.</w:t>
+        <w:t>O controle de estoque é feito por duas tabelas complementares: a de estoque, que mantém a quantidade disponível, a quantidade mínima e a validade de cada lote; e a de movimentações, que registra cada entrada ou saída de equipamento. A baixa de estoque segue a lógica FIFO (primeiro que entra, primeiro que sai), priorizando o lote de validade mais próxima, por meio de uma trigger que atualiza o estoque automaticamente a cada entrega registrada.</w:t>
       </w:r>
     </w:p>
     <w:p>
@@ -14791,7 +14794,19 @@
         <w:rPr>
           <w:szCs w:val="24"/>
         </w:rPr>
-        <w:t>A tabela de empresas é o ponto central do modelo, pois todos os dados cadastrados no sistema pertencem a uma empresa específica. Isso permite que o SIGEPI seja utilizado por múltiplas empresas de forma isolada, sem que os dados de uma organização sejam visíveis para outra. A empresa possui ainda um código de acesso único, gerado automaticamente, utilizado pelos funcionários para se vincularem a ela.</w:t>
+        <w:t>A tabela de entregas registra cada EPI entregue a um funcionário, com data de entrega, data de devolução (quando aplicável) e referência ao usuário que realizou o registro. Cada entrega possui uma situação (pendente, aceita, devolvida ou recusada): o funcionário deve confirmar ou recusar o recebimento do equipamento — registrando, na recusa, a data e o motivo —, o que atende à exigência de comprovação de entrega prevista na NR-6.</w:t>
+      </w:r>
+      <w:r>
+        <w:rPr>
+          <w:szCs w:val="24"/>
+        </w:rPr>
+        <w:t xml:space="preserve"> </w:t>
+      </w:r>
+      <w:r>
+        <w:rPr>
+          <w:szCs w:val="24"/>
+        </w:rPr>
+        <w:t>A tabela de solicitações permite que os funcionários solicitem a reposição de EPIs, com acompanhamento do status (pendente, aprovada ou recusada) pelo administrador.</w:t>
       </w:r>
     </w:p>
     <w:p>
@@ -14807,164 +14822,67 @@
         <w:rPr>
           <w:szCs w:val="24"/>
         </w:rPr>
+        <w:t xml:space="preserve">Por fim, a tabela de logs de auditoria é o pilar de rastreabilidade do sistema: nela é registrada automaticamente </w:t>
+      </w:r>
+      <w:r>
+        <w:rPr>
+          <w:szCs w:val="24"/>
+        </w:rPr>
+        <w:t>cada ação relevante --- acesso ao sistema (login), cadastro, edição e inativação de EPIs, entradas e saídas de estoque, entregas, confirmações e recusas de recebimento, devoluções, edição, inativação e reativação de funcionários, e a aprovação ou recusa de solicitações</w:t>
+      </w:r>
+      <w:r>
+        <w:rPr>
+          <w:szCs w:val="24"/>
+        </w:rPr>
+        <w:t>. Cada registro guarda o tipo da ação, a data e a hora, uma descrição, o responsável (nome e CPF) e a empresa correspondente, garantindo o histórico completo e auditável de tudo o que ocorre no sistema.</w:t>
+      </w:r>
+    </w:p>
+    <w:p>
+      <w:pPr>
+        <w:spacing w:line="360" w:lineRule="auto"/>
+        <w:ind w:firstLine="720"/>
+        <w:jc w:val="both"/>
+        <w:rPr>
+          <w:szCs w:val="24"/>
+        </w:rPr>
+      </w:pPr>
+      <w:r>
+        <w:rPr>
+          <w:szCs w:val="24"/>
+        </w:rPr>
+        <w:t xml:space="preserve">O diagrama entidade-relacionamento (DER) do banco de dados, apresentado na </w:t>
+      </w:r>
+      <w:r>
+        <w:rPr>
+          <w:szCs w:val="24"/>
+        </w:rPr>
+        <w:t>figura</w:t>
+      </w:r>
+      <w:r>
+        <w:rPr>
+          <w:szCs w:val="24"/>
+        </w:rPr>
+        <w:t xml:space="preserve"> a seguir, ilustra as tabelas do sistema e os relacionamentos estabelecidos entre elas.</w:t>
+      </w:r>
+    </w:p>
+    <w:p>
+      <w:pPr>
+        <w:spacing w:line="360" w:lineRule="auto"/>
+        <w:jc w:val="both"/>
+        <w:rPr>
+          <w:b/>
+          <w:bCs/>
+          <w:szCs w:val="24"/>
+        </w:rPr>
+      </w:pPr>
+      <w:r>
+        <w:rPr>
+          <w:b/>
+          <w:bCs/>
+          <w:noProof/>
+          <w:szCs w:val="24"/>
+        </w:rPr>
         <w:lastRenderedPageBreak/>
-        <w:t>A tabela de usuários armazena os dados de acesso — nome, e-mail, CPF, data de nascimento, senha criptografada e situação — e associa cada usuário a um perfil (administrador ou funcionário) por meio da tabela de tipos de usuário. O vínculo do usuário com uma empresa é opcional no momento do cadastro, o que permite que a conta exista antes de o usuário criar uma empresa (administrador) ou entrar em uma (funcionário, mediante o código de acesso). A tabela de funcionários complementa esses dados com nome, sobrenome, data de nascimento, setor de atuação e situação; quando um funcionário é inativado, o sistema registra também o motivo e a data da inativação, preservando o histórico por meio de exclusão lógica, sem apagar o registro.</w:t>
-      </w:r>
-    </w:p>
-    <w:p>
-      <w:pPr>
-        <w:spacing w:line="360" w:lineRule="auto"/>
-        <w:ind w:firstLine="720"/>
-        <w:jc w:val="both"/>
-        <w:rPr>
-          <w:szCs w:val="24"/>
-        </w:rPr>
-      </w:pPr>
-      <w:r>
-        <w:rPr>
-          <w:szCs w:val="24"/>
-        </w:rPr>
-        <w:t>Os EPIs são cadastrados em uma tabela própria, que contém nome, descrição, número e validade do Certificado de Aprovação (CA) e a categoria do equipamento. As categorias não são criadas pelo usuário: correspondem às oito categorias de proteção previstas na NR-6, inseridas previamente no banco. A validade do CA (</w:t>
-      </w:r>
-      <w:proofErr w:type="spellStart"/>
-      <w:r>
-        <w:rPr>
-          <w:szCs w:val="24"/>
-        </w:rPr>
-        <w:t>dt_validade_ca</w:t>
-      </w:r>
-      <w:proofErr w:type="spellEnd"/>
-      <w:r>
-        <w:rPr>
-          <w:szCs w:val="24"/>
-        </w:rPr>
-        <w:t>) é o campo que alimenta o cálculo de situação dos EPIs — regular, próximo do vencimento ou vencido — exibido nos filtros e no painel de dashboard.</w:t>
-      </w:r>
-    </w:p>
-    <w:p>
-      <w:pPr>
-        <w:spacing w:line="360" w:lineRule="auto"/>
-        <w:ind w:firstLine="720"/>
-        <w:jc w:val="both"/>
-        <w:rPr>
-          <w:szCs w:val="24"/>
-        </w:rPr>
-      </w:pPr>
-      <w:r>
-        <w:rPr>
-          <w:szCs w:val="24"/>
-        </w:rPr>
-        <w:t>O controle de estoque é feito por duas tabelas complementares: a de estoque, que mantém a quantidade disponível, a quantidade mínima e a validade de cada lote; e a de movimentações, que registra cada entrada ou saída de equipamento. A baixa de estoque segue a lógica FIFO (primeiro que entra, primeiro que sai), priorizando o lote de validade mais próxima, por meio de uma trigger que atualiza o estoque automaticamente a cada entrega registrada.</w:t>
-      </w:r>
-    </w:p>
-    <w:p>
-      <w:pPr>
-        <w:spacing w:line="360" w:lineRule="auto"/>
-        <w:ind w:firstLine="720"/>
-        <w:jc w:val="both"/>
-        <w:rPr>
-          <w:szCs w:val="24"/>
-        </w:rPr>
-      </w:pPr>
-      <w:r>
-        <w:rPr>
-          <w:szCs w:val="24"/>
-        </w:rPr>
-        <w:t>A tabela de entregas registra cada EPI entregue a um funcionário, com data de entrega, data de devolução (quando aplicável) e referência ao usuário que realizou o registro. Cada entrega possui uma situação (pendente, aceita, devolvida ou recusada): o funcionário deve confirmar ou recusar o recebimento do equipamento — registrando, na recusa, a data e o motivo —, o que atende à exigência de comprovação de entrega prevista na NR-6.</w:t>
-      </w:r>
-      <w:r>
-        <w:rPr>
-          <w:szCs w:val="24"/>
-        </w:rPr>
-        <w:t xml:space="preserve"> </w:t>
-      </w:r>
-      <w:r>
-        <w:rPr>
-          <w:szCs w:val="24"/>
-        </w:rPr>
-        <w:t>A tabela de solicitações permite que os funcionários solicitem a reposição de EPIs, com acompanhamento do status (pendente, aprovada ou recusada) pelo administrador.</w:t>
-      </w:r>
-    </w:p>
-    <w:p>
-      <w:pPr>
-        <w:spacing w:line="360" w:lineRule="auto"/>
-        <w:ind w:firstLine="720"/>
-        <w:jc w:val="both"/>
-        <w:rPr>
-          <w:szCs w:val="24"/>
-        </w:rPr>
-      </w:pPr>
-      <w:r>
-        <w:rPr>
-          <w:szCs w:val="24"/>
-        </w:rPr>
-        <w:t xml:space="preserve">Por fim, a tabela de logs de auditoria é o pilar de rastreabilidade do sistema: nela é registrada automaticamente </w:t>
-      </w:r>
-      <w:r>
-        <w:rPr>
-          <w:szCs w:val="24"/>
-        </w:rPr>
-        <w:t xml:space="preserve">cada ação relevante --- acesso ao sistema (login), cadastro, edição e inativação de EPIs, entradas e saídas de estoque, entregas, confirmações e recusas de recebimento, devoluções, edição, inativação e reativação </w:t>
-      </w:r>
-      <w:r>
-        <w:rPr>
-          <w:szCs w:val="24"/>
-        </w:rPr>
-        <w:lastRenderedPageBreak/>
-        <w:t>de funcionários, e a aprovação ou recusa de solicitações</w:t>
-      </w:r>
-      <w:r>
-        <w:rPr>
-          <w:szCs w:val="24"/>
-        </w:rPr>
-        <w:t>. Cada registro guarda o tipo da ação, a data e a hora, uma descrição, o responsável (nome e CPF) e a empresa correspondente, garantindo o histórico completo e auditável de tudo o que ocorre no sistema.</w:t>
-      </w:r>
-    </w:p>
-    <w:p>
-      <w:pPr>
-        <w:spacing w:line="360" w:lineRule="auto"/>
-        <w:ind w:firstLine="720"/>
-        <w:jc w:val="both"/>
-        <w:rPr>
-          <w:szCs w:val="24"/>
-        </w:rPr>
-      </w:pPr>
-      <w:r>
-        <w:rPr>
-          <w:szCs w:val="24"/>
-        </w:rPr>
-        <w:t xml:space="preserve">O diagrama entidade-relacionamento (DER) do banco de dados, apresentado na </w:t>
-      </w:r>
-      <w:r>
-        <w:rPr>
-          <w:szCs w:val="24"/>
-        </w:rPr>
-        <w:t>figura</w:t>
-      </w:r>
-      <w:r>
-        <w:rPr>
-          <w:szCs w:val="24"/>
-        </w:rPr>
-        <w:t xml:space="preserve"> a seguir, ilustra as tabelas do sistema e os relacionamentos estabelecidos entre elas.</w:t>
-      </w:r>
-    </w:p>
-    <w:p>
-      <w:pPr>
-        <w:spacing w:line="360" w:lineRule="auto"/>
-        <w:jc w:val="both"/>
-        <w:rPr>
-          <w:b/>
-          <w:bCs/>
-          <w:szCs w:val="24"/>
-        </w:rPr>
-      </w:pPr>
-      <w:r>
-        <w:rPr>
-          <w:b/>
-          <w:bCs/>
-          <w:noProof/>
-          <w:szCs w:val="24"/>
-        </w:rPr>
         <w:drawing>
           <wp:inline distT="0" distB="0" distL="0" distR="0" wp14:anchorId="32E335E9" wp14:editId="18B8FED9">
             <wp:extent cx="6318836" cy="5148243"/>
@@ -15178,6 +15096,7 @@
           <w:bCs/>
           <w:szCs w:val="24"/>
         </w:rPr>
+        <w:lastRenderedPageBreak/>
         <w:t>11 CRONOGRAMA</w:t>
       </w:r>
     </w:p>
@@ -15200,13 +15119,37 @@
         <w:rPr>
           <w:szCs w:val="24"/>
         </w:rPr>
-        <w:t>no início de</w:t>
-      </w:r>
-      <w:r>
-        <w:rPr>
-          <w:szCs w:val="24"/>
-        </w:rPr>
-        <w:t xml:space="preserve"> dezembro do mesmo ano.</w:t>
+        <w:t xml:space="preserve">no </w:t>
+      </w:r>
+      <w:r>
+        <w:rPr>
+          <w:szCs w:val="24"/>
+        </w:rPr>
+        <w:t>final</w:t>
+      </w:r>
+      <w:r>
+        <w:rPr>
+          <w:szCs w:val="24"/>
+        </w:rPr>
+        <w:t xml:space="preserve"> de</w:t>
+      </w:r>
+      <w:r>
+        <w:rPr>
+          <w:szCs w:val="24"/>
+        </w:rPr>
+        <w:t xml:space="preserve"> </w:t>
+      </w:r>
+      <w:r>
+        <w:rPr>
+          <w:szCs w:val="24"/>
+        </w:rPr>
+        <w:t>novembro</w:t>
+      </w:r>
+      <w:r>
+        <w:rPr>
+          <w:szCs w:val="24"/>
+        </w:rPr>
+        <w:t xml:space="preserve"> do mesmo ano.</w:t>
       </w:r>
     </w:p>
     <w:p>
@@ -15525,7 +15468,6 @@
         <w:rPr>
           <w:szCs w:val="24"/>
         </w:rPr>
-        <w:lastRenderedPageBreak/>
         <w:tab/>
         <w:t xml:space="preserve">A apresentação final do Trabalho de Conclusão de Curso </w:t>
       </w:r>
@@ -15533,91 +15475,104 @@
         <w:rPr>
           <w:szCs w:val="24"/>
         </w:rPr>
-        <w:t>será dia 04 de dezembro de 2026.</w:t>
-      </w:r>
-    </w:p>
-    <w:p>
-      <w:pPr>
-        <w:spacing w:line="360" w:lineRule="auto"/>
-        <w:jc w:val="both"/>
-        <w:rPr>
-          <w:b/>
-          <w:bCs/>
-          <w:szCs w:val="24"/>
-        </w:rPr>
-      </w:pPr>
-    </w:p>
-    <w:p>
-      <w:pPr>
-        <w:spacing w:line="360" w:lineRule="auto"/>
-        <w:jc w:val="both"/>
-        <w:rPr>
-          <w:b/>
-          <w:bCs/>
-          <w:szCs w:val="24"/>
-        </w:rPr>
-      </w:pPr>
-    </w:p>
-    <w:p>
-      <w:pPr>
-        <w:spacing w:line="360" w:lineRule="auto"/>
-        <w:jc w:val="both"/>
-        <w:rPr>
-          <w:b/>
-          <w:bCs/>
-          <w:szCs w:val="24"/>
-        </w:rPr>
-      </w:pPr>
-    </w:p>
-    <w:p>
-      <w:pPr>
-        <w:spacing w:line="360" w:lineRule="auto"/>
-        <w:jc w:val="both"/>
-        <w:rPr>
-          <w:b/>
-          <w:bCs/>
-          <w:szCs w:val="24"/>
-        </w:rPr>
-      </w:pPr>
-    </w:p>
-    <w:p>
-      <w:pPr>
-        <w:spacing w:line="360" w:lineRule="auto"/>
-        <w:jc w:val="both"/>
-        <w:rPr>
-          <w:b/>
-          <w:bCs/>
-          <w:szCs w:val="24"/>
-        </w:rPr>
-      </w:pPr>
-    </w:p>
-    <w:p>
-      <w:pPr>
-        <w:spacing w:line="360" w:lineRule="auto"/>
-        <w:jc w:val="both"/>
-        <w:rPr>
-          <w:b/>
-          <w:bCs/>
-          <w:szCs w:val="24"/>
-        </w:rPr>
-      </w:pPr>
-    </w:p>
-    <w:p>
-      <w:pPr>
-        <w:spacing w:line="360" w:lineRule="auto"/>
-        <w:jc w:val="both"/>
-        <w:rPr>
-          <w:b/>
-          <w:bCs/>
-          <w:szCs w:val="24"/>
-        </w:rPr>
-      </w:pPr>
-      <w:r>
-        <w:rPr>
-          <w:b/>
-          <w:bCs/>
-          <w:szCs w:val="24"/>
-        </w:rPr>
+        <w:t xml:space="preserve">será dia </w:t>
+      </w:r>
+      <w:r>
+        <w:rPr>
+          <w:szCs w:val="24"/>
+        </w:rPr>
+        <w:t xml:space="preserve">27 de novembro </w:t>
+      </w:r>
+      <w:r>
+        <w:rPr>
+          <w:szCs w:val="24"/>
+        </w:rPr>
+        <w:t>de 2026.</w:t>
+      </w:r>
+    </w:p>
+    <w:p>
+      <w:pPr>
+        <w:spacing w:line="360" w:lineRule="auto"/>
+        <w:jc w:val="both"/>
+        <w:rPr>
+          <w:b/>
+          <w:bCs/>
+          <w:szCs w:val="24"/>
+        </w:rPr>
+      </w:pPr>
+    </w:p>
+    <w:p>
+      <w:pPr>
+        <w:spacing w:line="360" w:lineRule="auto"/>
+        <w:jc w:val="both"/>
+        <w:rPr>
+          <w:b/>
+          <w:bCs/>
+          <w:szCs w:val="24"/>
+        </w:rPr>
+      </w:pPr>
+    </w:p>
+    <w:p>
+      <w:pPr>
+        <w:spacing w:line="360" w:lineRule="auto"/>
+        <w:jc w:val="both"/>
+        <w:rPr>
+          <w:b/>
+          <w:bCs/>
+          <w:szCs w:val="24"/>
+        </w:rPr>
+      </w:pPr>
+    </w:p>
+    <w:p>
+      <w:pPr>
+        <w:spacing w:line="360" w:lineRule="auto"/>
+        <w:jc w:val="both"/>
+        <w:rPr>
+          <w:b/>
+          <w:bCs/>
+          <w:szCs w:val="24"/>
+        </w:rPr>
+      </w:pPr>
+    </w:p>
+    <w:p>
+      <w:pPr>
+        <w:spacing w:line="360" w:lineRule="auto"/>
+        <w:jc w:val="both"/>
+        <w:rPr>
+          <w:b/>
+          <w:bCs/>
+          <w:szCs w:val="24"/>
+        </w:rPr>
+      </w:pPr>
+    </w:p>
+    <w:p>
+      <w:pPr>
+        <w:spacing w:line="360" w:lineRule="auto"/>
+        <w:jc w:val="both"/>
+        <w:rPr>
+          <w:b/>
+          <w:bCs/>
+          <w:szCs w:val="24"/>
+        </w:rPr>
+      </w:pPr>
+    </w:p>
+    <w:p>
+      <w:pPr>
+        <w:spacing w:line="360" w:lineRule="auto"/>
+        <w:jc w:val="both"/>
+        <w:rPr>
+          <w:b/>
+          <w:bCs/>
+          <w:szCs w:val="24"/>
+        </w:rPr>
+      </w:pPr>
+      <w:r>
+        <w:rPr>
+          <w:b/>
+          <w:bCs/>
+          <w:szCs w:val="24"/>
+        </w:rPr>
+        <w:lastRenderedPageBreak/>
         <w:t>12 IDENTIDADE VISUAL</w:t>
       </w:r>
     </w:p>
@@ -15813,120 +15768,92 @@
         <w:rPr>
           <w:szCs w:val="24"/>
         </w:rPr>
-        <w:t xml:space="preserve">A interface foi projetada para ser totalmente responsiva, adaptando-se a diferentes tamanhos de tela. Em dispositivos móveis, o sistema será acessível por </w:t>
-      </w:r>
-      <w:r>
-        <w:rPr>
+        <w:t>A interface foi projetada para ser totalmente responsiva, adaptando-se a diferentes tamanhos de tela. Em dispositivos móveis, o sistema será acessível por meio do Progressive Web App (PWA), mantendo a mesma identidade visual da versão web.</w:t>
+      </w:r>
+    </w:p>
+    <w:p>
+      <w:pPr>
+        <w:spacing w:line="360" w:lineRule="auto"/>
+        <w:jc w:val="both"/>
+        <w:rPr>
+          <w:b/>
+          <w:bCs/>
+          <w:szCs w:val="24"/>
+        </w:rPr>
+      </w:pPr>
+    </w:p>
+    <w:p>
+      <w:pPr>
+        <w:spacing w:line="360" w:lineRule="auto"/>
+        <w:jc w:val="both"/>
+        <w:rPr>
+          <w:b/>
+          <w:bCs/>
+          <w:szCs w:val="24"/>
+        </w:rPr>
+      </w:pPr>
+    </w:p>
+    <w:p>
+      <w:pPr>
+        <w:spacing w:line="360" w:lineRule="auto"/>
+        <w:jc w:val="both"/>
+        <w:rPr>
+          <w:b/>
+          <w:bCs/>
+          <w:szCs w:val="24"/>
+        </w:rPr>
+      </w:pPr>
+    </w:p>
+    <w:p>
+      <w:pPr>
+        <w:spacing w:line="360" w:lineRule="auto"/>
+        <w:jc w:val="both"/>
+        <w:rPr>
+          <w:b/>
+          <w:bCs/>
+          <w:szCs w:val="24"/>
+        </w:rPr>
+      </w:pPr>
+    </w:p>
+    <w:p>
+      <w:pPr>
+        <w:spacing w:line="360" w:lineRule="auto"/>
+        <w:jc w:val="both"/>
+        <w:rPr>
+          <w:b/>
+          <w:bCs/>
+          <w:szCs w:val="24"/>
+        </w:rPr>
+      </w:pPr>
+    </w:p>
+    <w:p>
+      <w:pPr>
+        <w:spacing w:line="360" w:lineRule="auto"/>
+        <w:jc w:val="both"/>
+        <w:rPr>
+          <w:b/>
+          <w:bCs/>
+          <w:szCs w:val="24"/>
+        </w:rPr>
+      </w:pPr>
+    </w:p>
+    <w:p>
+      <w:pPr>
+        <w:spacing w:line="360" w:lineRule="auto"/>
+        <w:jc w:val="both"/>
+        <w:rPr>
+          <w:b/>
+          <w:bCs/>
+          <w:szCs w:val="24"/>
+        </w:rPr>
+      </w:pPr>
+      <w:r>
+        <w:rPr>
+          <w:b/>
+          <w:bCs/>
           <w:szCs w:val="24"/>
         </w:rPr>
         <w:lastRenderedPageBreak/>
-        <w:t>meio do Progressive Web App (PWA), mantendo a mesma identidade visual da versão web.</w:t>
-      </w:r>
-    </w:p>
-    <w:p>
-      <w:pPr>
-        <w:spacing w:line="360" w:lineRule="auto"/>
-        <w:jc w:val="both"/>
-        <w:rPr>
-          <w:b/>
-          <w:bCs/>
-          <w:szCs w:val="24"/>
-        </w:rPr>
-      </w:pPr>
-    </w:p>
-    <w:p>
-      <w:pPr>
-        <w:spacing w:line="360" w:lineRule="auto"/>
-        <w:jc w:val="both"/>
-        <w:rPr>
-          <w:b/>
-          <w:bCs/>
-          <w:szCs w:val="24"/>
-        </w:rPr>
-      </w:pPr>
-    </w:p>
-    <w:p>
-      <w:pPr>
-        <w:spacing w:line="360" w:lineRule="auto"/>
-        <w:jc w:val="both"/>
-        <w:rPr>
-          <w:b/>
-          <w:bCs/>
-          <w:szCs w:val="24"/>
-        </w:rPr>
-      </w:pPr>
-    </w:p>
-    <w:p>
-      <w:pPr>
-        <w:spacing w:line="360" w:lineRule="auto"/>
-        <w:jc w:val="both"/>
-        <w:rPr>
-          <w:b/>
-          <w:bCs/>
-          <w:szCs w:val="24"/>
-        </w:rPr>
-      </w:pPr>
-    </w:p>
-    <w:p>
-      <w:pPr>
-        <w:spacing w:line="360" w:lineRule="auto"/>
-        <w:jc w:val="both"/>
-        <w:rPr>
-          <w:b/>
-          <w:bCs/>
-          <w:szCs w:val="24"/>
-        </w:rPr>
-      </w:pPr>
-    </w:p>
-    <w:p>
-      <w:pPr>
-        <w:spacing w:line="360" w:lineRule="auto"/>
-        <w:jc w:val="both"/>
-        <w:rPr>
-          <w:b/>
-          <w:bCs/>
-          <w:szCs w:val="24"/>
-        </w:rPr>
-      </w:pPr>
-    </w:p>
-    <w:p>
-      <w:pPr>
-        <w:spacing w:line="360" w:lineRule="auto"/>
-        <w:jc w:val="both"/>
-        <w:rPr>
-          <w:b/>
-          <w:bCs/>
-          <w:szCs w:val="24"/>
-        </w:rPr>
-      </w:pPr>
-    </w:p>
-    <w:p>
-      <w:pPr>
-        <w:spacing w:line="360" w:lineRule="auto"/>
-        <w:jc w:val="both"/>
-        <w:rPr>
-          <w:b/>
-          <w:bCs/>
-          <w:szCs w:val="24"/>
-        </w:rPr>
-      </w:pPr>
-    </w:p>
-    <w:p>
-      <w:pPr>
-        <w:spacing w:line="360" w:lineRule="auto"/>
-        <w:jc w:val="both"/>
-        <w:rPr>
-          <w:b/>
-          <w:bCs/>
-          <w:szCs w:val="24"/>
-        </w:rPr>
-      </w:pPr>
-      <w:r>
-        <w:rPr>
-          <w:b/>
-          <w:bCs/>
-          <w:szCs w:val="24"/>
-        </w:rPr>
         <w:t>1</w:t>
       </w:r>
       <w:r>
@@ -16144,131 +16071,125 @@
         <w:rPr>
           <w:szCs w:val="24"/>
         </w:rPr>
-        <w:t xml:space="preserve"> com dois fluxos distintos: o fluxo do Administrador, que engloba o cadastro da empresa, gestão de EPIs, acompanhamento de funcionários e visualização do dashboard; e o fluxo do Funcionário, que cobre a entrada na empresa, visualização dos seus EPIs e solicitação de reposição. A prototipação permitiu validar a usabilidade e antecipar </w:t>
-      </w:r>
-      <w:r>
-        <w:rPr>
+        <w:t xml:space="preserve"> com dois fluxos distintos: o fluxo do Administrador, que engloba o cadastro da empresa, gestão de EPIs, acompanhamento de funcionários e visualização do dashboard; e o fluxo do Funcionário, que cobre a entrada na empresa, visualização dos seus EPIs e solicitação de reposição. A prototipação permitiu validar a usabilidade e antecipar decisões de design antes da implementação, servindo como referência direta para o desenvolvimento do front-end.</w:t>
+      </w:r>
+    </w:p>
+    <w:p>
+      <w:pPr>
+        <w:spacing w:line="360" w:lineRule="auto"/>
+        <w:jc w:val="both"/>
+        <w:rPr>
+          <w:b/>
+          <w:bCs/>
+          <w:szCs w:val="24"/>
+        </w:rPr>
+      </w:pPr>
+    </w:p>
+    <w:p>
+      <w:pPr>
+        <w:spacing w:line="360" w:lineRule="auto"/>
+        <w:jc w:val="both"/>
+        <w:rPr>
+          <w:b/>
+          <w:bCs/>
+          <w:szCs w:val="24"/>
+        </w:rPr>
+      </w:pPr>
+    </w:p>
+    <w:p>
+      <w:pPr>
+        <w:spacing w:line="360" w:lineRule="auto"/>
+        <w:jc w:val="both"/>
+        <w:rPr>
+          <w:b/>
+          <w:bCs/>
+          <w:szCs w:val="24"/>
+        </w:rPr>
+      </w:pPr>
+    </w:p>
+    <w:p>
+      <w:pPr>
+        <w:spacing w:line="360" w:lineRule="auto"/>
+        <w:jc w:val="both"/>
+        <w:rPr>
+          <w:b/>
+          <w:bCs/>
+          <w:szCs w:val="24"/>
+        </w:rPr>
+      </w:pPr>
+    </w:p>
+    <w:p>
+      <w:pPr>
+        <w:spacing w:line="360" w:lineRule="auto"/>
+        <w:jc w:val="both"/>
+        <w:rPr>
+          <w:b/>
+          <w:bCs/>
+          <w:szCs w:val="24"/>
+        </w:rPr>
+      </w:pPr>
+    </w:p>
+    <w:p>
+      <w:pPr>
+        <w:spacing w:line="360" w:lineRule="auto"/>
+        <w:jc w:val="both"/>
+        <w:rPr>
+          <w:b/>
+          <w:bCs/>
+          <w:szCs w:val="24"/>
+        </w:rPr>
+      </w:pPr>
+    </w:p>
+    <w:p>
+      <w:pPr>
+        <w:spacing w:line="360" w:lineRule="auto"/>
+        <w:jc w:val="both"/>
+        <w:rPr>
+          <w:b/>
+          <w:bCs/>
+          <w:szCs w:val="24"/>
+        </w:rPr>
+      </w:pPr>
+    </w:p>
+    <w:p>
+      <w:pPr>
+        <w:spacing w:line="360" w:lineRule="auto"/>
+        <w:jc w:val="both"/>
+        <w:rPr>
+          <w:b/>
+          <w:bCs/>
+          <w:szCs w:val="24"/>
+        </w:rPr>
+      </w:pPr>
+    </w:p>
+    <w:p>
+      <w:pPr>
+        <w:spacing w:line="360" w:lineRule="auto"/>
+        <w:jc w:val="both"/>
+        <w:rPr>
+          <w:b/>
+          <w:bCs/>
+          <w:szCs w:val="24"/>
+        </w:rPr>
+      </w:pPr>
+    </w:p>
+    <w:p>
+      <w:pPr>
+        <w:spacing w:line="360" w:lineRule="auto"/>
+        <w:jc w:val="both"/>
+        <w:rPr>
+          <w:b/>
+          <w:bCs/>
+          <w:szCs w:val="24"/>
+        </w:rPr>
+      </w:pPr>
+      <w:r>
+        <w:rPr>
+          <w:b/>
+          <w:bCs/>
           <w:szCs w:val="24"/>
         </w:rPr>
         <w:lastRenderedPageBreak/>
-        <w:t>decisões de design antes da implementação, servindo como referência direta para o desenvolvimento do front-end.</w:t>
-      </w:r>
-    </w:p>
-    <w:p>
-      <w:pPr>
-        <w:spacing w:line="360" w:lineRule="auto"/>
-        <w:jc w:val="both"/>
-        <w:rPr>
-          <w:b/>
-          <w:bCs/>
-          <w:szCs w:val="24"/>
-        </w:rPr>
-      </w:pPr>
-    </w:p>
-    <w:p>
-      <w:pPr>
-        <w:spacing w:line="360" w:lineRule="auto"/>
-        <w:jc w:val="both"/>
-        <w:rPr>
-          <w:b/>
-          <w:bCs/>
-          <w:szCs w:val="24"/>
-        </w:rPr>
-      </w:pPr>
-    </w:p>
-    <w:p>
-      <w:pPr>
-        <w:spacing w:line="360" w:lineRule="auto"/>
-        <w:jc w:val="both"/>
-        <w:rPr>
-          <w:b/>
-          <w:bCs/>
-          <w:szCs w:val="24"/>
-        </w:rPr>
-      </w:pPr>
-    </w:p>
-    <w:p>
-      <w:pPr>
-        <w:spacing w:line="360" w:lineRule="auto"/>
-        <w:jc w:val="both"/>
-        <w:rPr>
-          <w:b/>
-          <w:bCs/>
-          <w:szCs w:val="24"/>
-        </w:rPr>
-      </w:pPr>
-    </w:p>
-    <w:p>
-      <w:pPr>
-        <w:spacing w:line="360" w:lineRule="auto"/>
-        <w:jc w:val="both"/>
-        <w:rPr>
-          <w:b/>
-          <w:bCs/>
-          <w:szCs w:val="24"/>
-        </w:rPr>
-      </w:pPr>
-    </w:p>
-    <w:p>
-      <w:pPr>
-        <w:spacing w:line="360" w:lineRule="auto"/>
-        <w:jc w:val="both"/>
-        <w:rPr>
-          <w:b/>
-          <w:bCs/>
-          <w:szCs w:val="24"/>
-        </w:rPr>
-      </w:pPr>
-    </w:p>
-    <w:p>
-      <w:pPr>
-        <w:spacing w:line="360" w:lineRule="auto"/>
-        <w:jc w:val="both"/>
-        <w:rPr>
-          <w:b/>
-          <w:bCs/>
-          <w:szCs w:val="24"/>
-        </w:rPr>
-      </w:pPr>
-    </w:p>
-    <w:p>
-      <w:pPr>
-        <w:spacing w:line="360" w:lineRule="auto"/>
-        <w:jc w:val="both"/>
-        <w:rPr>
-          <w:b/>
-          <w:bCs/>
-          <w:szCs w:val="24"/>
-        </w:rPr>
-      </w:pPr>
-    </w:p>
-    <w:p>
-      <w:pPr>
-        <w:spacing w:line="360" w:lineRule="auto"/>
-        <w:jc w:val="both"/>
-        <w:rPr>
-          <w:b/>
-          <w:bCs/>
-          <w:szCs w:val="24"/>
-        </w:rPr>
-      </w:pPr>
-    </w:p>
-    <w:p>
-      <w:pPr>
-        <w:spacing w:line="360" w:lineRule="auto"/>
-        <w:jc w:val="both"/>
-        <w:rPr>
-          <w:b/>
-          <w:bCs/>
-          <w:szCs w:val="24"/>
-        </w:rPr>
-      </w:pPr>
-      <w:r>
-        <w:rPr>
-          <w:b/>
-          <w:bCs/>
-          <w:szCs w:val="24"/>
-        </w:rPr>
         <w:t>1</w:t>
       </w:r>
       <w:r>
@@ -16399,14 +16320,176 @@
         <w:rPr>
           <w:szCs w:val="24"/>
         </w:rPr>
-        <w:t xml:space="preserve">Em termos de impacto para as organizações usuárias, o SIGEPI reduz o tempo gasto no controle de EPIs, diminui a ocorrência de erros nos registros e aumenta a rastreabilidade dos equipamentos. Esses benefícios contribuem diretamente para o </w:t>
-      </w:r>
-      <w:r>
-        <w:rPr>
+        <w:t>Em termos de impacto para as organizações usuárias, o SIGEPI reduz o tempo gasto no controle de EPIs, diminui a ocorrência de erros nos registros e aumenta a rastreabilidade dos equipamentos. Esses benefícios contribuem diretamente para o cumprimento das obrigações legais das empresas em relação à NR-6 e para a melhoria das condições de segurança dos trabalhadores.</w:t>
+      </w:r>
+    </w:p>
+    <w:p>
+      <w:pPr>
+        <w:spacing w:line="360" w:lineRule="auto"/>
+        <w:ind w:firstLine="720"/>
+        <w:jc w:val="both"/>
+        <w:rPr>
+          <w:szCs w:val="24"/>
+        </w:rPr>
+      </w:pPr>
+      <w:r>
+        <w:rPr>
+          <w:szCs w:val="24"/>
+        </w:rPr>
+        <w:t>Por fim, com a futura disponibilização da versão PWA, espera-se ampliar o alcance da aplicação, permitindo que supervisores e responsáveis por segurança utilizem o SIGEPI diretamente de seus dispositivos móveis em campo, sem depender de um computador.</w:t>
+      </w:r>
+    </w:p>
+    <w:p>
+      <w:pPr>
+        <w:spacing w:line="360" w:lineRule="auto"/>
+        <w:jc w:val="both"/>
+        <w:rPr>
+          <w:b/>
+          <w:bCs/>
+          <w:szCs w:val="24"/>
+        </w:rPr>
+      </w:pPr>
+    </w:p>
+    <w:p>
+      <w:pPr>
+        <w:spacing w:line="360" w:lineRule="auto"/>
+        <w:jc w:val="both"/>
+        <w:rPr>
+          <w:b/>
+          <w:bCs/>
+          <w:szCs w:val="24"/>
+        </w:rPr>
+      </w:pPr>
+    </w:p>
+    <w:p>
+      <w:pPr>
+        <w:spacing w:line="360" w:lineRule="auto"/>
+        <w:jc w:val="both"/>
+        <w:rPr>
+          <w:b/>
+          <w:bCs/>
+          <w:szCs w:val="24"/>
+        </w:rPr>
+      </w:pPr>
+    </w:p>
+    <w:p>
+      <w:pPr>
+        <w:spacing w:line="360" w:lineRule="auto"/>
+        <w:jc w:val="both"/>
+        <w:rPr>
+          <w:b/>
+          <w:bCs/>
+          <w:szCs w:val="24"/>
+        </w:rPr>
+      </w:pPr>
+    </w:p>
+    <w:p>
+      <w:pPr>
+        <w:spacing w:line="360" w:lineRule="auto"/>
+        <w:jc w:val="both"/>
+        <w:rPr>
+          <w:b/>
+          <w:bCs/>
+          <w:szCs w:val="24"/>
+        </w:rPr>
+      </w:pPr>
+    </w:p>
+    <w:p>
+      <w:pPr>
+        <w:spacing w:line="360" w:lineRule="auto"/>
+        <w:jc w:val="both"/>
+        <w:rPr>
+          <w:b/>
+          <w:bCs/>
+          <w:szCs w:val="24"/>
+        </w:rPr>
+      </w:pPr>
+    </w:p>
+    <w:p>
+      <w:pPr>
+        <w:spacing w:line="360" w:lineRule="auto"/>
+        <w:jc w:val="both"/>
+        <w:rPr>
+          <w:b/>
+          <w:bCs/>
+          <w:szCs w:val="24"/>
+        </w:rPr>
+      </w:pPr>
+      <w:r>
+        <w:rPr>
+          <w:b/>
+          <w:bCs/>
           <w:szCs w:val="24"/>
         </w:rPr>
         <w:lastRenderedPageBreak/>
-        <w:t>cumprimento das obrigações legais das empresas em relação à NR-6 e para a melhoria das condições de segurança dos trabalhadores.</w:t>
+        <w:t>1</w:t>
+      </w:r>
+      <w:r>
+        <w:rPr>
+          <w:b/>
+          <w:bCs/>
+          <w:szCs w:val="24"/>
+        </w:rPr>
+        <w:t>5</w:t>
+      </w:r>
+      <w:r>
+        <w:rPr>
+          <w:b/>
+          <w:bCs/>
+          <w:szCs w:val="24"/>
+        </w:rPr>
+        <w:t xml:space="preserve"> PRÓXIMOS PASSOS</w:t>
+      </w:r>
+    </w:p>
+    <w:p>
+      <w:pPr>
+        <w:spacing w:line="360" w:lineRule="auto"/>
+        <w:jc w:val="both"/>
+        <w:rPr>
+          <w:szCs w:val="24"/>
+        </w:rPr>
+      </w:pPr>
+      <w:r>
+        <w:rPr>
+          <w:b/>
+          <w:bCs/>
+          <w:szCs w:val="24"/>
+        </w:rPr>
+        <w:tab/>
+      </w:r>
+      <w:r>
+        <w:rPr>
+          <w:szCs w:val="24"/>
+        </w:rPr>
+        <w:t xml:space="preserve">Com o sistema web finalizado — </w:t>
+      </w:r>
+      <w:proofErr w:type="spellStart"/>
+      <w:r>
+        <w:rPr>
+          <w:szCs w:val="24"/>
+        </w:rPr>
+        <w:t>back-end</w:t>
+      </w:r>
+      <w:proofErr w:type="spellEnd"/>
+      <w:r>
+        <w:rPr>
+          <w:szCs w:val="24"/>
+        </w:rPr>
+        <w:t xml:space="preserve"> e front-</w:t>
+      </w:r>
+      <w:proofErr w:type="spellStart"/>
+      <w:r>
+        <w:rPr>
+          <w:szCs w:val="24"/>
+        </w:rPr>
+        <w:t>end</w:t>
+      </w:r>
+      <w:proofErr w:type="spellEnd"/>
+      <w:r>
+        <w:rPr>
+          <w:szCs w:val="24"/>
+        </w:rPr>
+        <w:t xml:space="preserve"> integrados e a camada de responsividade concluída para diferentes tamanhos de tela —, a equipe concentra-se agora nas etapas finais do projeto.</w:t>
       </w:r>
     </w:p>
     <w:p>
@@ -16422,170 +16505,85 @@
         <w:rPr>
           <w:szCs w:val="24"/>
         </w:rPr>
-        <w:t>Por fim, com a futura disponibilização da versão PWA, espera-se ampliar o alcance da aplicação, permitindo que supervisores e responsáveis por segurança utilizem o SIGEPI diretamente de seus dispositivos móveis em campo, sem depender de um computador.</w:t>
-      </w:r>
-    </w:p>
-    <w:p>
-      <w:pPr>
-        <w:spacing w:line="360" w:lineRule="auto"/>
-        <w:jc w:val="both"/>
-        <w:rPr>
-          <w:b/>
-          <w:bCs/>
-          <w:szCs w:val="24"/>
-        </w:rPr>
-      </w:pPr>
-    </w:p>
-    <w:p>
-      <w:pPr>
-        <w:spacing w:line="360" w:lineRule="auto"/>
-        <w:jc w:val="both"/>
-        <w:rPr>
-          <w:b/>
-          <w:bCs/>
-          <w:szCs w:val="24"/>
-        </w:rPr>
-      </w:pPr>
-    </w:p>
-    <w:p>
-      <w:pPr>
-        <w:spacing w:line="360" w:lineRule="auto"/>
-        <w:jc w:val="both"/>
-        <w:rPr>
-          <w:b/>
-          <w:bCs/>
-          <w:szCs w:val="24"/>
-        </w:rPr>
-      </w:pPr>
-    </w:p>
-    <w:p>
-      <w:pPr>
-        <w:spacing w:line="360" w:lineRule="auto"/>
-        <w:jc w:val="both"/>
-        <w:rPr>
-          <w:b/>
-          <w:bCs/>
-          <w:szCs w:val="24"/>
-        </w:rPr>
-      </w:pPr>
-    </w:p>
-    <w:p>
-      <w:pPr>
-        <w:spacing w:line="360" w:lineRule="auto"/>
-        <w:jc w:val="both"/>
-        <w:rPr>
-          <w:b/>
-          <w:bCs/>
-          <w:szCs w:val="24"/>
-        </w:rPr>
-      </w:pPr>
-    </w:p>
-    <w:p>
-      <w:pPr>
-        <w:spacing w:line="360" w:lineRule="auto"/>
-        <w:jc w:val="both"/>
-        <w:rPr>
-          <w:b/>
-          <w:bCs/>
-          <w:szCs w:val="24"/>
-        </w:rPr>
-      </w:pPr>
-    </w:p>
-    <w:p>
-      <w:pPr>
-        <w:spacing w:line="360" w:lineRule="auto"/>
-        <w:jc w:val="both"/>
-        <w:rPr>
-          <w:b/>
-          <w:bCs/>
-          <w:szCs w:val="24"/>
-        </w:rPr>
-      </w:pPr>
-    </w:p>
-    <w:p>
-      <w:pPr>
-        <w:spacing w:line="360" w:lineRule="auto"/>
-        <w:jc w:val="both"/>
-        <w:rPr>
-          <w:b/>
-          <w:bCs/>
-          <w:szCs w:val="24"/>
-        </w:rPr>
-      </w:pPr>
-    </w:p>
-    <w:p>
-      <w:pPr>
-        <w:spacing w:line="360" w:lineRule="auto"/>
-        <w:jc w:val="both"/>
-        <w:rPr>
-          <w:b/>
-          <w:bCs/>
-          <w:szCs w:val="24"/>
-        </w:rPr>
-      </w:pPr>
-    </w:p>
-    <w:p>
-      <w:pPr>
-        <w:spacing w:line="360" w:lineRule="auto"/>
-        <w:jc w:val="both"/>
-        <w:rPr>
-          <w:b/>
-          <w:bCs/>
-          <w:szCs w:val="24"/>
-        </w:rPr>
-      </w:pPr>
-      <w:r>
-        <w:rPr>
-          <w:b/>
-          <w:bCs/>
-          <w:szCs w:val="24"/>
-        </w:rPr>
-        <w:t>1</w:t>
-      </w:r>
-      <w:r>
-        <w:rPr>
-          <w:b/>
-          <w:bCs/>
-          <w:szCs w:val="24"/>
-        </w:rPr>
-        <w:t>5</w:t>
-      </w:r>
-      <w:r>
-        <w:rPr>
-          <w:b/>
-          <w:bCs/>
-          <w:szCs w:val="24"/>
-        </w:rPr>
-        <w:t xml:space="preserve"> PRÓXIMOS PASSOS</w:t>
-      </w:r>
-    </w:p>
-    <w:p>
-      <w:pPr>
-        <w:spacing w:line="360" w:lineRule="auto"/>
-        <w:jc w:val="both"/>
-        <w:rPr>
-          <w:szCs w:val="24"/>
-        </w:rPr>
-      </w:pPr>
-      <w:r>
-        <w:rPr>
-          <w:b/>
-          <w:bCs/>
-          <w:szCs w:val="24"/>
-        </w:rPr>
-        <w:tab/>
-      </w:r>
-      <w:r>
-        <w:rPr>
-          <w:szCs w:val="24"/>
-        </w:rPr>
-        <w:t xml:space="preserve">Com o sistema web finalizado — </w:t>
+        <w:t xml:space="preserve">O próximo passo é a transformação do sistema em um Progressive Web App (PWA), por meio da configuração do Service </w:t>
       </w:r>
       <w:proofErr w:type="spellStart"/>
       <w:r>
         <w:rPr>
           <w:szCs w:val="24"/>
         </w:rPr>
+        <w:t>Worker</w:t>
+      </w:r>
+      <w:proofErr w:type="spellEnd"/>
+      <w:r>
+        <w:rPr>
+          <w:szCs w:val="24"/>
+        </w:rPr>
+        <w:t xml:space="preserve">, do Web App </w:t>
+      </w:r>
+      <w:proofErr w:type="spellStart"/>
+      <w:r>
+        <w:rPr>
+          <w:szCs w:val="24"/>
+        </w:rPr>
+        <w:t>Manifest</w:t>
+      </w:r>
+      <w:proofErr w:type="spellEnd"/>
+      <w:r>
+        <w:rPr>
+          <w:szCs w:val="24"/>
+        </w:rPr>
+        <w:t xml:space="preserve"> e dos ícones de instalação, permitindo que o SIGEPI seja instalado em dispositivos móveis como um aplicativo, sem depender de lojas como Google Play ou App Store.</w:t>
+      </w:r>
+    </w:p>
+    <w:p>
+      <w:pPr>
+        <w:spacing w:line="360" w:lineRule="auto"/>
+        <w:ind w:firstLine="720"/>
+        <w:jc w:val="both"/>
+        <w:rPr>
+          <w:szCs w:val="24"/>
+        </w:rPr>
+      </w:pPr>
+      <w:r>
+        <w:rPr>
+          <w:szCs w:val="24"/>
+        </w:rPr>
+        <w:t>Em paralelo, será realizada a elaboração e a execução dos casos de teste, com base nos requisitos funcionais e não funcionais definidos na documentação. Essa etapa, conduzida sob a disciplina de Qualidade e Teste de Software, tem como objetivo validar o comportamento do sistema, identificar eventuais falhas e assegurar que cada funcionalidade atenda ao que foi especificado.</w:t>
+      </w:r>
+    </w:p>
+    <w:p>
+      <w:pPr>
+        <w:spacing w:line="360" w:lineRule="auto"/>
+        <w:ind w:firstLine="720"/>
+        <w:jc w:val="both"/>
+        <w:rPr>
+          <w:szCs w:val="24"/>
+        </w:rPr>
+      </w:pPr>
+      <w:r>
+        <w:rPr>
+          <w:szCs w:val="24"/>
+        </w:rPr>
+        <w:t xml:space="preserve">Concluídos os testes, o sistema </w:t>
+      </w:r>
+      <w:r>
+        <w:rPr>
+          <w:szCs w:val="24"/>
+        </w:rPr>
+        <w:t>foi hospedado</w:t>
+      </w:r>
+      <w:r>
+        <w:rPr>
+          <w:szCs w:val="24"/>
+        </w:rPr>
+        <w:t xml:space="preserve"> em ambiente de produção, com a publicação do </w:t>
+      </w:r>
+      <w:proofErr w:type="spellStart"/>
+      <w:r>
+        <w:rPr>
+          <w:szCs w:val="24"/>
+        </w:rPr>
         <w:t>back-end</w:t>
       </w:r>
       <w:proofErr w:type="spellEnd"/>
@@ -16593,21 +16591,7 @@
         <w:rPr>
           <w:szCs w:val="24"/>
         </w:rPr>
-        <w:t xml:space="preserve"> e front-</w:t>
-      </w:r>
-      <w:proofErr w:type="spellStart"/>
-      <w:r>
-        <w:rPr>
-          <w:szCs w:val="24"/>
-        </w:rPr>
-        <w:t>end</w:t>
-      </w:r>
-      <w:proofErr w:type="spellEnd"/>
-      <w:r>
-        <w:rPr>
-          <w:szCs w:val="24"/>
-        </w:rPr>
-        <w:t xml:space="preserve"> integrados e a camada de responsividade concluída para diferentes tamanhos de tela —, a equipe concentra-se agora nas etapas finais do projeto.</w:t>
+        <w:t xml:space="preserve"> e do banco de dados MySQL em plataformas de hospedagem gratuitas, como Railway ou Render, seguida do registro e da configuração de um domínio próprio, tornando a aplicação acessível publicamente pela internet.</w:t>
       </w:r>
     </w:p>
     <w:p>
@@ -16623,197 +16607,158 @@
         <w:rPr>
           <w:szCs w:val="24"/>
         </w:rPr>
-        <w:t xml:space="preserve">O próximo passo é a transformação do sistema em um Progressive Web App (PWA), por meio da configuração do Service </w:t>
-      </w:r>
-      <w:proofErr w:type="spellStart"/>
-      <w:r>
-        <w:rPr>
-          <w:szCs w:val="24"/>
-        </w:rPr>
-        <w:t>Worker</w:t>
-      </w:r>
-      <w:proofErr w:type="spellEnd"/>
-      <w:r>
-        <w:rPr>
-          <w:szCs w:val="24"/>
-        </w:rPr>
-        <w:t xml:space="preserve">, do Web App </w:t>
-      </w:r>
-      <w:proofErr w:type="spellStart"/>
-      <w:r>
-        <w:rPr>
-          <w:szCs w:val="24"/>
-        </w:rPr>
-        <w:t>Manifest</w:t>
-      </w:r>
-      <w:proofErr w:type="spellEnd"/>
-      <w:r>
-        <w:rPr>
-          <w:szCs w:val="24"/>
-        </w:rPr>
-        <w:t xml:space="preserve"> e dos ícones de instalação, permitindo que o SIGEPI seja instalado em dispositivos móveis como um aplicativo, sem depender de lojas como Google Play ou App Store.</w:t>
-      </w:r>
-    </w:p>
-    <w:p>
-      <w:pPr>
-        <w:spacing w:line="360" w:lineRule="auto"/>
-        <w:ind w:firstLine="720"/>
-        <w:jc w:val="both"/>
-        <w:rPr>
-          <w:szCs w:val="24"/>
-        </w:rPr>
-      </w:pPr>
-      <w:r>
-        <w:rPr>
-          <w:szCs w:val="24"/>
-        </w:rPr>
-        <w:t>Em paralelo, será realizada a elaboração e a execução dos casos de teste, com base nos requisitos funcionais e não funcionais definidos na documentação. Essa etapa, conduzida sob a disciplina de Qualidade e Teste de Software, tem como objetivo validar o comportamento do sistema, identificar eventuais falhas e assegurar que cada funcionalidade atenda ao que foi especificado.</w:t>
-      </w:r>
-    </w:p>
-    <w:p>
-      <w:pPr>
-        <w:spacing w:line="360" w:lineRule="auto"/>
-        <w:ind w:firstLine="720"/>
-        <w:jc w:val="both"/>
-        <w:rPr>
-          <w:szCs w:val="24"/>
-        </w:rPr>
-      </w:pPr>
-      <w:r>
-        <w:rPr>
-          <w:szCs w:val="24"/>
-        </w:rPr>
-        <w:t xml:space="preserve">Concluídos os testes, o sistema será hospedado em ambiente de produção, com a publicação do </w:t>
-      </w:r>
-      <w:proofErr w:type="spellStart"/>
-      <w:r>
-        <w:rPr>
-          <w:szCs w:val="24"/>
-        </w:rPr>
-        <w:t>back-end</w:t>
-      </w:r>
-      <w:proofErr w:type="spellEnd"/>
-      <w:r>
-        <w:rPr>
-          <w:szCs w:val="24"/>
-        </w:rPr>
-        <w:t xml:space="preserve"> e do banco de dados MySQL em plataformas de hospedagem gratuitas, como Railway ou Render, seguida do registro e da configuração de um domínio próprio, tornando a aplicação acessível publicamente pela internet.</w:t>
-      </w:r>
-    </w:p>
-    <w:p>
-      <w:pPr>
-        <w:spacing w:line="360" w:lineRule="auto"/>
-        <w:ind w:firstLine="720"/>
-        <w:jc w:val="both"/>
-        <w:rPr>
-          <w:szCs w:val="24"/>
-        </w:rPr>
-      </w:pPr>
-      <w:r>
-        <w:rPr>
+        <w:t xml:space="preserve">Por fim, a partir do retorno obtido nos testes e na hospedagem, serão realizados os retoques e ajustes finais de usabilidade e segurança, além da preparação dos slides e do material para a apresentação final do Trabalho de Conclusão de Curso, prevista para o </w:t>
+      </w:r>
+      <w:r>
+        <w:rPr>
+          <w:szCs w:val="24"/>
+        </w:rPr>
+        <w:t>final</w:t>
+      </w:r>
+      <w:r>
+        <w:rPr>
+          <w:szCs w:val="24"/>
+        </w:rPr>
+        <w:t xml:space="preserve"> de </w:t>
+      </w:r>
+      <w:r>
+        <w:rPr>
+          <w:szCs w:val="24"/>
+        </w:rPr>
+        <w:t>novembro</w:t>
+      </w:r>
+      <w:r>
+        <w:rPr>
+          <w:szCs w:val="24"/>
+        </w:rPr>
+        <w:t xml:space="preserve"> de 2026.</w:t>
+      </w:r>
+    </w:p>
+    <w:p>
+      <w:pPr>
+        <w:spacing w:line="360" w:lineRule="auto"/>
+        <w:jc w:val="both"/>
+        <w:rPr>
+          <w:szCs w:val="24"/>
+        </w:rPr>
+      </w:pPr>
+    </w:p>
+    <w:p>
+      <w:pPr>
+        <w:spacing w:line="360" w:lineRule="auto"/>
+        <w:jc w:val="both"/>
+        <w:rPr>
+          <w:szCs w:val="24"/>
+        </w:rPr>
+      </w:pPr>
+    </w:p>
+    <w:p>
+      <w:pPr>
+        <w:spacing w:line="360" w:lineRule="auto"/>
+        <w:jc w:val="both"/>
+        <w:rPr>
+          <w:szCs w:val="24"/>
+        </w:rPr>
+      </w:pPr>
+    </w:p>
+    <w:p>
+      <w:pPr>
+        <w:spacing w:line="360" w:lineRule="auto"/>
+        <w:jc w:val="both"/>
+        <w:rPr>
+          <w:szCs w:val="24"/>
+        </w:rPr>
+      </w:pPr>
+    </w:p>
+    <w:p>
+      <w:pPr>
+        <w:spacing w:line="360" w:lineRule="auto"/>
+        <w:jc w:val="both"/>
+        <w:rPr>
+          <w:szCs w:val="24"/>
+        </w:rPr>
+      </w:pPr>
+    </w:p>
+    <w:p>
+      <w:pPr>
+        <w:spacing w:line="360" w:lineRule="auto"/>
+        <w:jc w:val="both"/>
+        <w:rPr>
+          <w:szCs w:val="24"/>
+        </w:rPr>
+      </w:pPr>
+    </w:p>
+    <w:p>
+      <w:pPr>
+        <w:spacing w:line="360" w:lineRule="auto"/>
+        <w:jc w:val="both"/>
+        <w:rPr>
+          <w:szCs w:val="24"/>
+        </w:rPr>
+      </w:pPr>
+    </w:p>
+    <w:p>
+      <w:pPr>
+        <w:spacing w:line="360" w:lineRule="auto"/>
+        <w:jc w:val="both"/>
+        <w:rPr>
+          <w:szCs w:val="24"/>
+        </w:rPr>
+      </w:pPr>
+    </w:p>
+    <w:p>
+      <w:pPr>
+        <w:spacing w:line="360" w:lineRule="auto"/>
+        <w:jc w:val="both"/>
+        <w:rPr>
+          <w:szCs w:val="24"/>
+        </w:rPr>
+      </w:pPr>
+    </w:p>
+    <w:p>
+      <w:pPr>
+        <w:spacing w:line="360" w:lineRule="auto"/>
+        <w:jc w:val="both"/>
+        <w:rPr>
+          <w:szCs w:val="24"/>
+        </w:rPr>
+      </w:pPr>
+    </w:p>
+    <w:p>
+      <w:pPr>
+        <w:spacing w:line="360" w:lineRule="auto"/>
+        <w:jc w:val="both"/>
+        <w:rPr>
+          <w:szCs w:val="24"/>
+        </w:rPr>
+      </w:pPr>
+    </w:p>
+    <w:p>
+      <w:pPr>
+        <w:spacing w:line="360" w:lineRule="auto"/>
+        <w:jc w:val="both"/>
+        <w:rPr>
+          <w:szCs w:val="24"/>
+        </w:rPr>
+      </w:pPr>
+    </w:p>
+    <w:p>
+      <w:pPr>
+        <w:spacing w:line="360" w:lineRule="auto"/>
+        <w:jc w:val="both"/>
+        <w:rPr>
+          <w:b/>
+          <w:bCs/>
+          <w:szCs w:val="24"/>
+        </w:rPr>
+      </w:pPr>
+      <w:r>
+        <w:rPr>
+          <w:b/>
+          <w:bCs/>
           <w:szCs w:val="24"/>
         </w:rPr>
         <w:lastRenderedPageBreak/>
-        <w:t>Por fim, a partir do retorno obtido nos testes e na hospedagem, serão realizados os retoques e ajustes finais de usabilidade e segurança, além da preparação dos slides e do material para a apresentação final do Trabalho de Conclusão de Curso, prevista para o início de dezembro de 2026.</w:t>
-      </w:r>
-    </w:p>
-    <w:p>
-      <w:pPr>
-        <w:spacing w:line="360" w:lineRule="auto"/>
-        <w:jc w:val="both"/>
-        <w:rPr>
-          <w:szCs w:val="24"/>
-        </w:rPr>
-      </w:pPr>
-    </w:p>
-    <w:p>
-      <w:pPr>
-        <w:spacing w:line="360" w:lineRule="auto"/>
-        <w:jc w:val="both"/>
-        <w:rPr>
-          <w:szCs w:val="24"/>
-        </w:rPr>
-      </w:pPr>
-    </w:p>
-    <w:p>
-      <w:pPr>
-        <w:spacing w:line="360" w:lineRule="auto"/>
-        <w:jc w:val="both"/>
-        <w:rPr>
-          <w:szCs w:val="24"/>
-        </w:rPr>
-      </w:pPr>
-    </w:p>
-    <w:p>
-      <w:pPr>
-        <w:spacing w:line="360" w:lineRule="auto"/>
-        <w:jc w:val="both"/>
-        <w:rPr>
-          <w:szCs w:val="24"/>
-        </w:rPr>
-      </w:pPr>
-    </w:p>
-    <w:p>
-      <w:pPr>
-        <w:spacing w:line="360" w:lineRule="auto"/>
-        <w:jc w:val="both"/>
-        <w:rPr>
-          <w:szCs w:val="24"/>
-        </w:rPr>
-      </w:pPr>
-    </w:p>
-    <w:p>
-      <w:pPr>
-        <w:spacing w:line="360" w:lineRule="auto"/>
-        <w:jc w:val="both"/>
-        <w:rPr>
-          <w:szCs w:val="24"/>
-        </w:rPr>
-      </w:pPr>
-    </w:p>
-    <w:p>
-      <w:pPr>
-        <w:spacing w:line="360" w:lineRule="auto"/>
-        <w:jc w:val="both"/>
-        <w:rPr>
-          <w:szCs w:val="24"/>
-        </w:rPr>
-      </w:pPr>
-    </w:p>
-    <w:p>
-      <w:pPr>
-        <w:spacing w:line="360" w:lineRule="auto"/>
-        <w:jc w:val="both"/>
-        <w:rPr>
-          <w:szCs w:val="24"/>
-        </w:rPr>
-      </w:pPr>
-    </w:p>
-    <w:p>
-      <w:pPr>
-        <w:spacing w:line="360" w:lineRule="auto"/>
-        <w:jc w:val="both"/>
-        <w:rPr>
-          <w:szCs w:val="24"/>
-        </w:rPr>
-      </w:pPr>
-    </w:p>
-    <w:p>
-      <w:pPr>
-        <w:spacing w:line="360" w:lineRule="auto"/>
-        <w:jc w:val="both"/>
-        <w:rPr>
-          <w:b/>
-          <w:bCs/>
-          <w:szCs w:val="24"/>
-        </w:rPr>
-      </w:pPr>
-      <w:r>
-        <w:rPr>
-          <w:b/>
-          <w:bCs/>
-          <w:szCs w:val="24"/>
-        </w:rPr>
         <w:t>1</w:t>
       </w:r>
       <w:r>
@@ -18153,6 +18098,7 @@
   <w:style w:type="character" w:default="1" w:styleId="Fontepargpadro">
     <w:name w:val="Default Paragraph Font"/>
     <w:uiPriority w:val="1"/>
+    <w:semiHidden/>
     <w:unhideWhenUsed/>
   </w:style>
   <w:style w:type="table" w:default="1" w:styleId="Tabelanormal">

</xml_diff>

<commit_message>
Implementação de um Requisito na Documentação
</commit_message>
<xml_diff>
--- a/Documentação/Quarta Edição/TCC - Documentação.docx
+++ b/Documentação/Quarta Edição/TCC - Documentação.docx
@@ -13751,62 +13751,569 @@
         </w:rPr>
       </w:pPr>
     </w:p>
-    <w:p>
-      <w:pPr>
-        <w:spacing w:line="360" w:lineRule="auto"/>
-        <w:rPr>
-          <w:szCs w:val="24"/>
-        </w:rPr>
-      </w:pPr>
-    </w:p>
-    <w:p>
-      <w:pPr>
-        <w:spacing w:line="360" w:lineRule="auto"/>
-        <w:rPr>
-          <w:szCs w:val="24"/>
-        </w:rPr>
-      </w:pPr>
-    </w:p>
-    <w:p>
-      <w:pPr>
-        <w:spacing w:line="360" w:lineRule="auto"/>
-        <w:rPr>
-          <w:szCs w:val="24"/>
-        </w:rPr>
-      </w:pPr>
-    </w:p>
-    <w:p>
-      <w:pPr>
-        <w:spacing w:line="360" w:lineRule="auto"/>
-        <w:rPr>
-          <w:szCs w:val="24"/>
-        </w:rPr>
-      </w:pPr>
-    </w:p>
-    <w:p>
-      <w:pPr>
-        <w:spacing w:line="360" w:lineRule="auto"/>
-        <w:rPr>
-          <w:szCs w:val="24"/>
-        </w:rPr>
-      </w:pPr>
-    </w:p>
-    <w:p>
-      <w:pPr>
-        <w:spacing w:line="360" w:lineRule="auto"/>
-        <w:jc w:val="both"/>
-        <w:rPr>
-          <w:b/>
-          <w:bCs/>
-          <w:szCs w:val="24"/>
-        </w:rPr>
-      </w:pPr>
-      <w:r>
-        <w:rPr>
-          <w:b/>
-          <w:bCs/>
-          <w:szCs w:val="24"/>
-        </w:rPr>
+    <w:p/>
+    <w:p/>
+    <w:tbl>
+      <w:tblPr>
+        <w:tblStyle w:val="Tabelacomgrade"/>
+        <w:tblW w:w="0" w:type="auto"/>
+        <w:tblLook w:val="04A0" w:firstRow="1" w:lastRow="0" w:firstColumn="1" w:lastColumn="0" w:noHBand="0" w:noVBand="1"/>
+      </w:tblPr>
+      <w:tblGrid>
+        <w:gridCol w:w="1364"/>
+        <w:gridCol w:w="539"/>
+        <w:gridCol w:w="1063"/>
+        <w:gridCol w:w="3254"/>
+        <w:gridCol w:w="2541"/>
+      </w:tblGrid>
+      <w:tr>
+        <w:tc>
+          <w:tcPr>
+            <w:tcW w:w="1364" w:type="dxa"/>
+          </w:tcPr>
+          <w:p>
+            <w:pPr>
+              <w:spacing w:line="360" w:lineRule="auto"/>
+              <w:rPr>
+                <w:b/>
+                <w:bCs/>
+                <w:szCs w:val="24"/>
+              </w:rPr>
+            </w:pPr>
+            <w:r>
+              <w:rPr>
+                <w:b/>
+                <w:bCs/>
+                <w:szCs w:val="24"/>
+              </w:rPr>
+              <w:t>F1</w:t>
+            </w:r>
+            <w:r>
+              <w:rPr>
+                <w:b/>
+                <w:bCs/>
+                <w:szCs w:val="24"/>
+              </w:rPr>
+              <w:t>9</w:t>
+            </w:r>
+          </w:p>
+        </w:tc>
+        <w:tc>
+          <w:tcPr>
+            <w:tcW w:w="7397" w:type="dxa"/>
+            <w:gridSpan w:val="4"/>
+          </w:tcPr>
+          <w:p>
+            <w:pPr>
+              <w:spacing w:line="360" w:lineRule="auto"/>
+              <w:rPr>
+                <w:szCs w:val="24"/>
+              </w:rPr>
+            </w:pPr>
+            <w:r>
+              <w:t>Cadastrar Funcionário (pelo Administrador)</w:t>
+            </w:r>
+          </w:p>
+        </w:tc>
+      </w:tr>
+      <w:tr>
+        <w:tc>
+          <w:tcPr>
+            <w:tcW w:w="1364" w:type="dxa"/>
+          </w:tcPr>
+          <w:p>
+            <w:pPr>
+              <w:spacing w:line="360" w:lineRule="auto"/>
+              <w:rPr>
+                <w:b/>
+                <w:bCs/>
+                <w:szCs w:val="24"/>
+              </w:rPr>
+            </w:pPr>
+            <w:r>
+              <w:rPr>
+                <w:b/>
+                <w:bCs/>
+                <w:szCs w:val="24"/>
+              </w:rPr>
+              <w:t>Descrição</w:t>
+            </w:r>
+          </w:p>
+        </w:tc>
+        <w:tc>
+          <w:tcPr>
+            <w:tcW w:w="7397" w:type="dxa"/>
+            <w:gridSpan w:val="4"/>
+          </w:tcPr>
+          <w:p>
+            <w:pPr>
+              <w:spacing w:line="360" w:lineRule="auto"/>
+            </w:pPr>
+            <w:r>
+              <w:t xml:space="preserve">Administrador cadastra um funcionário diretamente no sistema, criando também a conta de acesso (login) dele, sem depender do </w:t>
+            </w:r>
+            <w:proofErr w:type="spellStart"/>
+            <w:r>
+              <w:t>autocadastro</w:t>
+            </w:r>
+            <w:proofErr w:type="spellEnd"/>
+          </w:p>
+        </w:tc>
+      </w:tr>
+      <w:tr>
+        <w:tc>
+          <w:tcPr>
+            <w:tcW w:w="1903" w:type="dxa"/>
+            <w:gridSpan w:val="2"/>
+          </w:tcPr>
+          <w:p>
+            <w:pPr>
+              <w:spacing w:line="360" w:lineRule="auto"/>
+              <w:rPr>
+                <w:b/>
+                <w:bCs/>
+                <w:szCs w:val="24"/>
+              </w:rPr>
+            </w:pPr>
+            <w:r>
+              <w:rPr>
+                <w:b/>
+                <w:bCs/>
+                <w:szCs w:val="24"/>
+              </w:rPr>
+              <w:t>Pré-condição</w:t>
+            </w:r>
+          </w:p>
+        </w:tc>
+        <w:tc>
+          <w:tcPr>
+            <w:tcW w:w="6858" w:type="dxa"/>
+            <w:gridSpan w:val="3"/>
+          </w:tcPr>
+          <w:p>
+            <w:pPr>
+              <w:spacing w:line="360" w:lineRule="auto"/>
+              <w:rPr>
+                <w:szCs w:val="24"/>
+              </w:rPr>
+            </w:pPr>
+            <w:r>
+              <w:t>Usuário autenticado como administrador e com empresa cadastrada; o setor informado deve pertencer à empresa</w:t>
+            </w:r>
+          </w:p>
+        </w:tc>
+      </w:tr>
+      <w:tr>
+        <w:tc>
+          <w:tcPr>
+            <w:tcW w:w="1903" w:type="dxa"/>
+            <w:gridSpan w:val="2"/>
+          </w:tcPr>
+          <w:p>
+            <w:pPr>
+              <w:spacing w:line="360" w:lineRule="auto"/>
+              <w:rPr>
+                <w:b/>
+                <w:bCs/>
+                <w:szCs w:val="24"/>
+              </w:rPr>
+            </w:pPr>
+            <w:r>
+              <w:rPr>
+                <w:b/>
+                <w:bCs/>
+                <w:szCs w:val="24"/>
+              </w:rPr>
+              <w:t>Pós-condição</w:t>
+            </w:r>
+          </w:p>
+        </w:tc>
+        <w:tc>
+          <w:tcPr>
+            <w:tcW w:w="6858" w:type="dxa"/>
+            <w:gridSpan w:val="3"/>
+          </w:tcPr>
+          <w:p>
+            <w:pPr>
+              <w:spacing w:line="360" w:lineRule="auto"/>
+              <w:rPr>
+                <w:szCs w:val="24"/>
+              </w:rPr>
+            </w:pPr>
+            <w:r>
+              <w:t>São criados o registro do funcionário e a sua conta de usuário, ambos vinculados à empresa, permitindo que ele acesse o sistema com e-mail e senha</w:t>
+            </w:r>
+          </w:p>
+        </w:tc>
+      </w:tr>
+      <w:tr>
+        <w:tc>
+          <w:tcPr>
+            <w:tcW w:w="8761" w:type="dxa"/>
+            <w:gridSpan w:val="5"/>
+          </w:tcPr>
+          <w:p>
+            <w:pPr>
+              <w:spacing w:line="360" w:lineRule="auto"/>
+              <w:jc w:val="center"/>
+              <w:rPr>
+                <w:b/>
+                <w:bCs/>
+                <w:szCs w:val="24"/>
+              </w:rPr>
+            </w:pPr>
+            <w:r>
+              <w:rPr>
+                <w:b/>
+                <w:bCs/>
+                <w:szCs w:val="24"/>
+              </w:rPr>
+              <w:t>Requisitos Não Funcional</w:t>
+            </w:r>
+          </w:p>
+        </w:tc>
+      </w:tr>
+      <w:tr>
+        <w:tc>
+          <w:tcPr>
+            <w:tcW w:w="2966" w:type="dxa"/>
+            <w:gridSpan w:val="3"/>
+          </w:tcPr>
+          <w:p>
+            <w:pPr>
+              <w:spacing w:line="360" w:lineRule="auto"/>
+              <w:jc w:val="center"/>
+              <w:rPr>
+                <w:b/>
+                <w:bCs/>
+                <w:szCs w:val="24"/>
+              </w:rPr>
+            </w:pPr>
+            <w:proofErr w:type="spellStart"/>
+            <w:r>
+              <w:rPr>
+                <w:b/>
+                <w:bCs/>
+                <w:szCs w:val="24"/>
+              </w:rPr>
+              <w:t>Cód</w:t>
+            </w:r>
+            <w:proofErr w:type="spellEnd"/>
+            <w:r>
+              <w:rPr>
+                <w:b/>
+                <w:bCs/>
+                <w:szCs w:val="24"/>
+              </w:rPr>
+              <w:t>-Nome</w:t>
+            </w:r>
+          </w:p>
+        </w:tc>
+        <w:tc>
+          <w:tcPr>
+            <w:tcW w:w="3254" w:type="dxa"/>
+          </w:tcPr>
+          <w:p>
+            <w:pPr>
+              <w:spacing w:line="360" w:lineRule="auto"/>
+              <w:jc w:val="center"/>
+              <w:rPr>
+                <w:b/>
+                <w:bCs/>
+                <w:szCs w:val="24"/>
+              </w:rPr>
+            </w:pPr>
+            <w:r>
+              <w:rPr>
+                <w:b/>
+                <w:bCs/>
+                <w:szCs w:val="24"/>
+              </w:rPr>
+              <w:t>Descrição</w:t>
+            </w:r>
+          </w:p>
+        </w:tc>
+        <w:tc>
+          <w:tcPr>
+            <w:tcW w:w="2541" w:type="dxa"/>
+          </w:tcPr>
+          <w:p>
+            <w:pPr>
+              <w:spacing w:line="360" w:lineRule="auto"/>
+              <w:jc w:val="center"/>
+              <w:rPr>
+                <w:b/>
+                <w:bCs/>
+                <w:szCs w:val="24"/>
+              </w:rPr>
+            </w:pPr>
+            <w:r>
+              <w:rPr>
+                <w:b/>
+                <w:bCs/>
+                <w:szCs w:val="24"/>
+              </w:rPr>
+              <w:t>Categoria</w:t>
+            </w:r>
+          </w:p>
+        </w:tc>
+      </w:tr>
+      <w:tr>
+        <w:tc>
+          <w:tcPr>
+            <w:tcW w:w="2966" w:type="dxa"/>
+            <w:gridSpan w:val="3"/>
+          </w:tcPr>
+          <w:p>
+            <w:pPr>
+              <w:spacing w:line="360" w:lineRule="auto"/>
+              <w:rPr>
+                <w:szCs w:val="24"/>
+              </w:rPr>
+            </w:pPr>
+            <w:r>
+              <w:rPr>
+                <w:szCs w:val="24"/>
+              </w:rPr>
+              <w:t>NF19.1 Validação de dados</w:t>
+            </w:r>
+          </w:p>
+        </w:tc>
+        <w:tc>
+          <w:tcPr>
+            <w:tcW w:w="3254" w:type="dxa"/>
+          </w:tcPr>
+          <w:p>
+            <w:pPr>
+              <w:spacing w:line="360" w:lineRule="auto"/>
+              <w:rPr>
+                <w:szCs w:val="24"/>
+              </w:rPr>
+            </w:pPr>
+            <w:r>
+              <w:t>O sistema deve validar nome, e-mail, senha, CPF e setor, e impedir e-mail ou CPF já cadastrados.</w:t>
+            </w:r>
+          </w:p>
+        </w:tc>
+        <w:tc>
+          <w:tcPr>
+            <w:tcW w:w="2541" w:type="dxa"/>
+          </w:tcPr>
+          <w:p>
+            <w:pPr>
+              <w:spacing w:line="360" w:lineRule="auto"/>
+              <w:rPr>
+                <w:szCs w:val="24"/>
+              </w:rPr>
+            </w:pPr>
+            <w:r>
+              <w:rPr>
+                <w:szCs w:val="24"/>
+              </w:rPr>
+              <w:t>Segurança</w:t>
+            </w:r>
+          </w:p>
+        </w:tc>
+      </w:tr>
+      <w:tr>
+        <w:tc>
+          <w:tcPr>
+            <w:tcW w:w="2966" w:type="dxa"/>
+            <w:gridSpan w:val="3"/>
+          </w:tcPr>
+          <w:p>
+            <w:pPr>
+              <w:spacing w:line="360" w:lineRule="auto"/>
+              <w:rPr>
+                <w:szCs w:val="24"/>
+              </w:rPr>
+            </w:pPr>
+            <w:r>
+              <w:rPr>
+                <w:szCs w:val="24"/>
+              </w:rPr>
+              <w:t>NF19.2 Proteção da senha</w:t>
+            </w:r>
+          </w:p>
+        </w:tc>
+        <w:tc>
+          <w:tcPr>
+            <w:tcW w:w="3254" w:type="dxa"/>
+          </w:tcPr>
+          <w:p>
+            <w:pPr>
+              <w:spacing w:line="360" w:lineRule="auto"/>
+              <w:rPr>
+                <w:szCs w:val="24"/>
+              </w:rPr>
+            </w:pPr>
+            <w:r>
+              <w:t xml:space="preserve">A senha deve ser armazenada com </w:t>
+            </w:r>
+            <w:proofErr w:type="spellStart"/>
+            <w:r>
+              <w:t>hash</w:t>
+            </w:r>
+            <w:proofErr w:type="spellEnd"/>
+            <w:r>
+              <w:t xml:space="preserve"> (</w:t>
+            </w:r>
+            <w:proofErr w:type="spellStart"/>
+            <w:r>
+              <w:t>bcrypt</w:t>
+            </w:r>
+            <w:proofErr w:type="spellEnd"/>
+            <w:r>
+              <w:t>), nunca em texto puro.</w:t>
+            </w:r>
+          </w:p>
+        </w:tc>
+        <w:tc>
+          <w:tcPr>
+            <w:tcW w:w="2541" w:type="dxa"/>
+          </w:tcPr>
+          <w:p>
+            <w:pPr>
+              <w:spacing w:line="360" w:lineRule="auto"/>
+              <w:rPr>
+                <w:szCs w:val="24"/>
+              </w:rPr>
+            </w:pPr>
+            <w:r>
+              <w:rPr>
+                <w:szCs w:val="24"/>
+              </w:rPr>
+              <w:t>Segurança</w:t>
+            </w:r>
+          </w:p>
+        </w:tc>
+      </w:tr>
+      <w:tr>
+        <w:tc>
+          <w:tcPr>
+            <w:tcW w:w="2966" w:type="dxa"/>
+            <w:gridSpan w:val="3"/>
+          </w:tcPr>
+          <w:p>
+            <w:pPr>
+              <w:spacing w:line="360" w:lineRule="auto"/>
+              <w:rPr>
+                <w:szCs w:val="24"/>
+              </w:rPr>
+            </w:pPr>
+            <w:r>
+              <w:rPr>
+                <w:szCs w:val="24"/>
+              </w:rPr>
+              <w:t>NF1</w:t>
+            </w:r>
+            <w:r>
+              <w:rPr>
+                <w:szCs w:val="24"/>
+              </w:rPr>
+              <w:t>9</w:t>
+            </w:r>
+            <w:r>
+              <w:rPr>
+                <w:szCs w:val="24"/>
+              </w:rPr>
+              <w:t xml:space="preserve">.3 </w:t>
+            </w:r>
+            <w:r>
+              <w:rPr>
+                <w:szCs w:val="24"/>
+              </w:rPr>
+              <w:t>Atomicidade</w:t>
+            </w:r>
+          </w:p>
+        </w:tc>
+        <w:tc>
+          <w:tcPr>
+            <w:tcW w:w="3254" w:type="dxa"/>
+          </w:tcPr>
+          <w:p>
+            <w:pPr>
+              <w:spacing w:line="360" w:lineRule="auto"/>
+              <w:rPr>
+                <w:szCs w:val="24"/>
+              </w:rPr>
+            </w:pPr>
+            <w:r>
+              <w:t>A conta de usuário e o funcionário devem ser criados de forma atômica — se um falhar, nenhum é gravado.</w:t>
+            </w:r>
+          </w:p>
+        </w:tc>
+        <w:tc>
+          <w:tcPr>
+            <w:tcW w:w="2541" w:type="dxa"/>
+          </w:tcPr>
+          <w:p>
+            <w:pPr>
+              <w:spacing w:line="360" w:lineRule="auto"/>
+              <w:rPr>
+                <w:szCs w:val="24"/>
+              </w:rPr>
+            </w:pPr>
+            <w:r>
+              <w:rPr>
+                <w:szCs w:val="24"/>
+              </w:rPr>
+              <w:t>Confiabilidade</w:t>
+            </w:r>
+          </w:p>
+        </w:tc>
+      </w:tr>
+    </w:tbl>
+    <w:p>
+      <w:pPr>
+        <w:spacing w:line="360" w:lineRule="auto"/>
+        <w:jc w:val="both"/>
+        <w:rPr>
+          <w:b/>
+          <w:bCs/>
+          <w:szCs w:val="24"/>
+        </w:rPr>
+      </w:pPr>
+    </w:p>
+    <w:p>
+      <w:pPr>
+        <w:spacing w:line="360" w:lineRule="auto"/>
+        <w:jc w:val="both"/>
+        <w:rPr>
+          <w:b/>
+          <w:bCs/>
+          <w:szCs w:val="24"/>
+        </w:rPr>
+      </w:pPr>
+    </w:p>
+    <w:p>
+      <w:pPr>
+        <w:spacing w:line="360" w:lineRule="auto"/>
+        <w:jc w:val="both"/>
+        <w:rPr>
+          <w:b/>
+          <w:bCs/>
+          <w:szCs w:val="24"/>
+        </w:rPr>
+      </w:pPr>
+    </w:p>
+    <w:p>
+      <w:pPr>
+        <w:spacing w:line="360" w:lineRule="auto"/>
+        <w:jc w:val="both"/>
+        <w:rPr>
+          <w:b/>
+          <w:bCs/>
+          <w:szCs w:val="24"/>
+        </w:rPr>
+      </w:pPr>
+      <w:r>
+        <w:rPr>
+          <w:b/>
+          <w:bCs/>
+          <w:szCs w:val="24"/>
+        </w:rPr>
+        <w:lastRenderedPageBreak/>
         <w:t>8</w:t>
       </w:r>
       <w:r>
@@ -13971,9 +14478,141 @@
           <w:bCs/>
           <w:szCs w:val="24"/>
         </w:rPr>
+        <w:t>9 TECNOLOGIAS ADOTADAS</w:t>
+      </w:r>
+    </w:p>
+    <w:p>
+      <w:pPr>
+        <w:spacing w:line="360" w:lineRule="auto"/>
+        <w:ind w:firstLine="720"/>
+        <w:jc w:val="both"/>
+        <w:rPr>
+          <w:szCs w:val="24"/>
+        </w:rPr>
+      </w:pPr>
+      <w:r>
+        <w:rPr>
+          <w:szCs w:val="24"/>
+        </w:rPr>
+        <w:t>A escolha das tecnologias do SIGEPI foi baseada em dois critérios principais: a familiaridade da equipe com as ferramentas e a adequação de cada tecnologia às necessidades do sistema. A seguir, são descritas as principais tecnologias adotadas e a justificativa para cada escolha.</w:t>
+      </w:r>
+    </w:p>
+    <w:p>
+      <w:pPr>
+        <w:spacing w:line="360" w:lineRule="auto"/>
+        <w:jc w:val="both"/>
+        <w:rPr>
+          <w:b/>
+          <w:bCs/>
+          <w:szCs w:val="24"/>
+        </w:rPr>
+      </w:pPr>
+      <w:r>
+        <w:rPr>
+          <w:b/>
+          <w:bCs/>
+          <w:szCs w:val="24"/>
+        </w:rPr>
+        <w:t>Front-</w:t>
+      </w:r>
+      <w:proofErr w:type="spellStart"/>
+      <w:r>
+        <w:rPr>
+          <w:b/>
+          <w:bCs/>
+          <w:szCs w:val="24"/>
+        </w:rPr>
+        <w:t>end</w:t>
+      </w:r>
+      <w:proofErr w:type="spellEnd"/>
+    </w:p>
+    <w:p>
+      <w:pPr>
+        <w:spacing w:line="360" w:lineRule="auto"/>
+        <w:ind w:firstLine="720"/>
+        <w:jc w:val="both"/>
+        <w:rPr>
+          <w:szCs w:val="24"/>
+        </w:rPr>
+      </w:pPr>
+      <w:r>
+        <w:rPr>
+          <w:szCs w:val="24"/>
+        </w:rPr>
+        <w:t xml:space="preserve">A interface do sistema foi construída com HTML, CSS e </w:t>
+      </w:r>
+      <w:proofErr w:type="spellStart"/>
+      <w:r>
+        <w:rPr>
+          <w:szCs w:val="24"/>
+        </w:rPr>
+        <w:t>JavaScript</w:t>
+      </w:r>
+      <w:proofErr w:type="spellEnd"/>
+      <w:r>
+        <w:rPr>
+          <w:szCs w:val="24"/>
+        </w:rPr>
+        <w:t xml:space="preserve"> puro. Essa combinação foi escolhida por ser a base do desenvolvimento web e por já ter sido trabalhada pela equipe durante o curso. O </w:t>
+      </w:r>
+      <w:proofErr w:type="spellStart"/>
+      <w:r>
+        <w:rPr>
+          <w:szCs w:val="24"/>
+        </w:rPr>
+        <w:t>JavaScript</w:t>
+      </w:r>
+      <w:proofErr w:type="spellEnd"/>
+      <w:r>
+        <w:rPr>
+          <w:szCs w:val="24"/>
+        </w:rPr>
+        <w:t xml:space="preserve"> foi utilizado para a manipulação dinâmica da interface e para a comunicação com a API do </w:t>
+      </w:r>
+      <w:proofErr w:type="spellStart"/>
+      <w:r>
+        <w:rPr>
+          <w:szCs w:val="24"/>
+        </w:rPr>
+        <w:t>back-end</w:t>
+      </w:r>
+      <w:proofErr w:type="spellEnd"/>
+      <w:r>
+        <w:rPr>
+          <w:szCs w:val="24"/>
+        </w:rPr>
+        <w:t xml:space="preserve"> por meio de requisições assíncronas.</w:t>
+      </w:r>
+    </w:p>
+    <w:p>
+      <w:pPr>
+        <w:spacing w:line="360" w:lineRule="auto"/>
+        <w:jc w:val="both"/>
+        <w:rPr>
+          <w:b/>
+          <w:bCs/>
+          <w:szCs w:val="24"/>
+        </w:rPr>
+      </w:pPr>
+      <w:r>
+        <w:rPr>
+          <w:b/>
+          <w:bCs/>
+          <w:szCs w:val="24"/>
+        </w:rPr>
         <w:lastRenderedPageBreak/>
-        <w:t>9 TECNOLOGIAS ADOTADAS</w:t>
-      </w:r>
+        <w:t>Back-</w:t>
+      </w:r>
+      <w:proofErr w:type="spellStart"/>
+      <w:r>
+        <w:rPr>
+          <w:b/>
+          <w:bCs/>
+          <w:szCs w:val="24"/>
+        </w:rPr>
+        <w:t>end</w:t>
+      </w:r>
+      <w:proofErr w:type="spellEnd"/>
     </w:p>
     <w:p>
       <w:pPr>
@@ -13988,37 +14627,570 @@
         <w:rPr>
           <w:szCs w:val="24"/>
         </w:rPr>
-        <w:t>A escolha das tecnologias do SIGEPI foi baseada em dois critérios principais: a familiaridade da equipe com as ferramentas e a adequação de cada tecnologia às necessidades do sistema. A seguir, são descritas as principais tecnologias adotadas e a justificativa para cada escolha.</w:t>
-      </w:r>
-    </w:p>
-    <w:p>
-      <w:pPr>
-        <w:spacing w:line="360" w:lineRule="auto"/>
-        <w:jc w:val="both"/>
-        <w:rPr>
-          <w:b/>
-          <w:bCs/>
-          <w:szCs w:val="24"/>
-        </w:rPr>
-      </w:pPr>
-      <w:r>
-        <w:rPr>
-          <w:b/>
-          <w:bCs/>
-          <w:szCs w:val="24"/>
-        </w:rPr>
-        <w:t>Front-</w:t>
+        <w:t xml:space="preserve">O </w:t>
       </w:r>
       <w:proofErr w:type="spellStart"/>
       <w:r>
         <w:rPr>
-          <w:b/>
-          <w:bCs/>
+          <w:szCs w:val="24"/>
+        </w:rPr>
+        <w:t>back-end</w:t>
+      </w:r>
+      <w:proofErr w:type="spellEnd"/>
+      <w:r>
+        <w:rPr>
+          <w:szCs w:val="24"/>
+        </w:rPr>
+        <w:t xml:space="preserve"> da aplicação foi desenvolvido com Node.js, plataforma que permite executar </w:t>
+      </w:r>
+      <w:proofErr w:type="spellStart"/>
+      <w:r>
+        <w:rPr>
+          <w:szCs w:val="24"/>
+        </w:rPr>
+        <w:t>JavaScript</w:t>
+      </w:r>
+      <w:proofErr w:type="spellEnd"/>
+      <w:r>
+        <w:rPr>
+          <w:szCs w:val="24"/>
+        </w:rPr>
+        <w:t xml:space="preserve"> no servidor, e com o framework Express.js, que simplifica a criação de APIs. O Express.js foi escolhido por sua leveza, flexibilidade e pela grande quantidade de bibliotecas disponíveis no ecossistema Node.js. Entre as bibliotecas utilizadas, destacam-se o </w:t>
+      </w:r>
+      <w:proofErr w:type="spellStart"/>
+      <w:r>
+        <w:rPr>
+          <w:szCs w:val="24"/>
+        </w:rPr>
+        <w:t>bcrypt</w:t>
+      </w:r>
+      <w:proofErr w:type="spellEnd"/>
+      <w:r>
+        <w:rPr>
+          <w:szCs w:val="24"/>
+        </w:rPr>
+        <w:t xml:space="preserve">, para a criptografia das senhas; o </w:t>
+      </w:r>
+      <w:proofErr w:type="spellStart"/>
+      <w:r>
+        <w:rPr>
+          <w:szCs w:val="24"/>
+        </w:rPr>
+        <w:t>jsonwebtoken</w:t>
+      </w:r>
+      <w:proofErr w:type="spellEnd"/>
+      <w:r>
+        <w:rPr>
+          <w:szCs w:val="24"/>
+        </w:rPr>
+        <w:t xml:space="preserve">, para a autenticação por meio de tokens JWT; e o </w:t>
+      </w:r>
+      <w:proofErr w:type="spellStart"/>
+      <w:r>
+        <w:rPr>
+          <w:szCs w:val="24"/>
+        </w:rPr>
+        <w:t>helmet</w:t>
+      </w:r>
+      <w:proofErr w:type="spellEnd"/>
+      <w:r>
+        <w:rPr>
+          <w:szCs w:val="24"/>
+        </w:rPr>
+        <w:t xml:space="preserve"> e o </w:t>
+      </w:r>
+      <w:proofErr w:type="spellStart"/>
+      <w:r>
+        <w:rPr>
+          <w:szCs w:val="24"/>
+        </w:rPr>
+        <w:t>express</w:t>
+      </w:r>
+      <w:proofErr w:type="spellEnd"/>
+      <w:r>
+        <w:rPr>
+          <w:szCs w:val="24"/>
+        </w:rPr>
+        <w:t>-rate-</w:t>
+      </w:r>
+      <w:proofErr w:type="spellStart"/>
+      <w:r>
+        <w:rPr>
+          <w:szCs w:val="24"/>
+        </w:rPr>
+        <w:t>limit</w:t>
+      </w:r>
+      <w:proofErr w:type="spellEnd"/>
+      <w:r>
+        <w:rPr>
+          <w:szCs w:val="24"/>
+        </w:rPr>
+        <w:t>, que reforçam a segurança da aplicação com cabeçalhos HTTP de proteção e limitação de tentativas de acesso.</w:t>
+      </w:r>
+    </w:p>
+    <w:p>
+      <w:pPr>
+        <w:spacing w:line="360" w:lineRule="auto"/>
+        <w:jc w:val="both"/>
+        <w:rPr>
+          <w:b/>
+          <w:bCs/>
+          <w:szCs w:val="24"/>
+        </w:rPr>
+      </w:pPr>
+      <w:r>
+        <w:rPr>
+          <w:b/>
+          <w:bCs/>
+          <w:szCs w:val="24"/>
+        </w:rPr>
+        <w:t>Banco de Dados</w:t>
+      </w:r>
+    </w:p>
+    <w:p>
+      <w:pPr>
+        <w:spacing w:line="360" w:lineRule="auto"/>
+        <w:jc w:val="both"/>
+        <w:rPr>
+          <w:szCs w:val="24"/>
+        </w:rPr>
+      </w:pPr>
+      <w:r>
+        <w:rPr>
+          <w:szCs w:val="24"/>
+        </w:rPr>
+        <w:tab/>
+      </w:r>
+      <w:r>
+        <w:rPr>
+          <w:szCs w:val="24"/>
+        </w:rPr>
+        <w:t>Para o armazenamento dos dados, foi utilizado o MySQL, um sistema de gerenciamento de banco de dados relacional. Sua escolha se justificou pela necessidade de manter a integridade referencial entre as tabelas do sistema, como a relação entre funcionários, EPIs e movimentações de estoque. O MySQL é uma tecnologia madura, amplamente adotada no mercado e com suporte nativo no ecossistema Node.js por meio de bibliotecas como o mysql2.</w:t>
+      </w:r>
+    </w:p>
+    <w:p>
+      <w:pPr>
+        <w:spacing w:line="360" w:lineRule="auto"/>
+        <w:jc w:val="both"/>
+        <w:rPr>
+          <w:b/>
+          <w:bCs/>
+          <w:szCs w:val="24"/>
+        </w:rPr>
+      </w:pPr>
+      <w:r>
+        <w:rPr>
+          <w:b/>
+          <w:bCs/>
+          <w:szCs w:val="24"/>
+        </w:rPr>
+        <w:t>Ferramentas de Desenvolvimento</w:t>
+      </w:r>
+    </w:p>
+    <w:p>
+      <w:pPr>
+        <w:spacing w:line="360" w:lineRule="auto"/>
+        <w:jc w:val="both"/>
+        <w:rPr>
+          <w:szCs w:val="24"/>
+        </w:rPr>
+      </w:pPr>
+      <w:r>
+        <w:rPr>
+          <w:szCs w:val="24"/>
+        </w:rPr>
+        <w:tab/>
+      </w:r>
+      <w:r>
+        <w:rPr>
+          <w:szCs w:val="24"/>
+        </w:rPr>
+        <w:t xml:space="preserve">Para o desenvolvimento do código, a equipe utilizou o Visual Studio </w:t>
+      </w:r>
+      <w:proofErr w:type="spellStart"/>
+      <w:r>
+        <w:rPr>
+          <w:szCs w:val="24"/>
+        </w:rPr>
+        <w:t>Code</w:t>
+      </w:r>
+      <w:proofErr w:type="spellEnd"/>
+      <w:r>
+        <w:rPr>
+          <w:szCs w:val="24"/>
+        </w:rPr>
+        <w:t xml:space="preserve">, editor gratuito e amplamente adotado na indústria. A prototipação das telas foi realizada no </w:t>
+      </w:r>
+      <w:proofErr w:type="spellStart"/>
+      <w:r>
+        <w:rPr>
+          <w:szCs w:val="24"/>
+        </w:rPr>
+        <w:t>Figma</w:t>
+      </w:r>
+      <w:proofErr w:type="spellEnd"/>
+      <w:r>
+        <w:rPr>
+          <w:szCs w:val="24"/>
+        </w:rPr>
+        <w:t xml:space="preserve">, que permitiu criar e validar as interfaces antes do desenvolvimento. Para os testes das rotas da API, foi utilizado o </w:t>
+      </w:r>
+      <w:proofErr w:type="spellStart"/>
+      <w:r>
+        <w:rPr>
+          <w:szCs w:val="24"/>
+        </w:rPr>
+        <w:t>Postman</w:t>
+      </w:r>
+      <w:proofErr w:type="spellEnd"/>
+      <w:r>
+        <w:rPr>
+          <w:szCs w:val="24"/>
+        </w:rPr>
+        <w:t xml:space="preserve">, ferramenta que facilita o envio de requisições HTTP e a verificação das respostas do servidor. O controle de versão do código foi feito com </w:t>
+      </w:r>
+      <w:proofErr w:type="spellStart"/>
+      <w:r>
+        <w:rPr>
+          <w:szCs w:val="24"/>
+        </w:rPr>
+        <w:t>Git</w:t>
+      </w:r>
+      <w:proofErr w:type="spellEnd"/>
+      <w:r>
+        <w:rPr>
+          <w:szCs w:val="24"/>
+        </w:rPr>
+        <w:t xml:space="preserve"> e GitHub.</w:t>
+      </w:r>
+    </w:p>
+    <w:p>
+      <w:pPr>
+        <w:spacing w:line="360" w:lineRule="auto"/>
+        <w:jc w:val="both"/>
+        <w:rPr>
+          <w:b/>
+          <w:bCs/>
+          <w:szCs w:val="24"/>
+        </w:rPr>
+      </w:pPr>
+      <w:r>
+        <w:rPr>
+          <w:b/>
+          <w:bCs/>
+          <w:szCs w:val="24"/>
+        </w:rPr>
+        <w:t>Progressive Web App (PWA)</w:t>
+      </w:r>
+    </w:p>
+    <w:p>
+      <w:pPr>
+        <w:spacing w:line="360" w:lineRule="auto"/>
+        <w:jc w:val="both"/>
+        <w:rPr>
+          <w:szCs w:val="24"/>
+        </w:rPr>
+      </w:pPr>
+      <w:r>
+        <w:rPr>
+          <w:szCs w:val="24"/>
+        </w:rPr>
+        <w:tab/>
+      </w:r>
+      <w:r>
+        <w:rPr>
+          <w:szCs w:val="24"/>
+        </w:rPr>
+        <w:t xml:space="preserve">Após a conclusão da versão web, o sistema será adaptado para funcionar como um Progressive Web App. Essa abordagem permitirá que o SIGEPI seja instalado em dispositivos móveis como se fosse um aplicativo nativo, sem a necessidade de publicação em lojas como Google Play ou App Store. O PWA utiliza recursos como Service Workers e Web App </w:t>
+      </w:r>
+      <w:proofErr w:type="spellStart"/>
+      <w:r>
+        <w:rPr>
+          <w:szCs w:val="24"/>
+        </w:rPr>
+        <w:t>Manifest</w:t>
+      </w:r>
+      <w:proofErr w:type="spellEnd"/>
+      <w:r>
+        <w:rPr>
+          <w:szCs w:val="24"/>
+        </w:rPr>
+        <w:t xml:space="preserve"> para oferecer uma experiência próxima à de um aplicativo móvel, mantendo a mesma base de código da versão web.</w:t>
+      </w:r>
+    </w:p>
+    <w:p>
+      <w:pPr>
+        <w:spacing w:line="360" w:lineRule="auto"/>
+        <w:jc w:val="both"/>
+        <w:rPr>
+          <w:b/>
+          <w:bCs/>
+          <w:szCs w:val="24"/>
+        </w:rPr>
+      </w:pPr>
+      <w:r>
+        <w:rPr>
+          <w:b/>
+          <w:bCs/>
+          <w:szCs w:val="24"/>
+        </w:rPr>
+        <w:t>Hospedagem</w:t>
+      </w:r>
+    </w:p>
+    <w:p>
+      <w:pPr>
+        <w:spacing w:line="360" w:lineRule="auto"/>
+        <w:jc w:val="both"/>
+        <w:rPr>
+          <w:b/>
+          <w:bCs/>
+          <w:szCs w:val="24"/>
+        </w:rPr>
+      </w:pPr>
+      <w:r>
+        <w:rPr>
+          <w:b/>
+          <w:bCs/>
+          <w:szCs w:val="24"/>
+        </w:rPr>
+        <w:tab/>
+      </w:r>
+      <w:r>
+        <w:rPr>
+          <w:szCs w:val="24"/>
+        </w:rPr>
+        <w:t>Para a disponibilização do sistema em ambiente de produção, adotou-se uma arquitetura de hospedagem dividida. O front-</w:t>
+      </w:r>
+      <w:proofErr w:type="spellStart"/>
+      <w:r>
+        <w:rPr>
           <w:szCs w:val="24"/>
         </w:rPr>
         <w:t>end</w:t>
       </w:r>
       <w:proofErr w:type="spellEnd"/>
+      <w:r>
+        <w:rPr>
+          <w:szCs w:val="24"/>
+        </w:rPr>
+        <w:t xml:space="preserve">, composto por arquivos estáticos, foi publicado em plataforma de hospedagem de sites estáticos com certificado HTTPS </w:t>
+      </w:r>
+      <w:r>
+        <w:rPr>
+          <w:szCs w:val="24"/>
+        </w:rPr>
+        <w:lastRenderedPageBreak/>
+        <w:t xml:space="preserve">automático. O </w:t>
+      </w:r>
+      <w:proofErr w:type="spellStart"/>
+      <w:r>
+        <w:rPr>
+          <w:szCs w:val="24"/>
+        </w:rPr>
+        <w:t>back-end</w:t>
+      </w:r>
+      <w:proofErr w:type="spellEnd"/>
+      <w:r>
+        <w:rPr>
+          <w:szCs w:val="24"/>
+        </w:rPr>
+        <w:t>, desenvolvido em Node.js, e o banco de dados MySQL foram hospedados em plataforma de aplicações que mantém o servidor em execução contínua, permitindo o acesso à API a qualquer momento. A adoção de HTTPS não é apenas uma exigência de segurança para o tráfego de credenciais: é também requisito técnico para o funcionamento do Progressive Web App, uma vez que os navegadores só permitem o registro de Service Workers em conexões seguras.</w:t>
+      </w:r>
+    </w:p>
+    <w:p>
+      <w:pPr>
+        <w:spacing w:line="360" w:lineRule="auto"/>
+        <w:jc w:val="both"/>
+        <w:rPr>
+          <w:szCs w:val="24"/>
+        </w:rPr>
+      </w:pPr>
+    </w:p>
+    <w:p>
+      <w:pPr>
+        <w:spacing w:line="360" w:lineRule="auto"/>
+        <w:jc w:val="both"/>
+        <w:rPr>
+          <w:szCs w:val="24"/>
+        </w:rPr>
+      </w:pPr>
+    </w:p>
+    <w:p>
+      <w:pPr>
+        <w:spacing w:line="360" w:lineRule="auto"/>
+        <w:jc w:val="both"/>
+        <w:rPr>
+          <w:szCs w:val="24"/>
+        </w:rPr>
+      </w:pPr>
+    </w:p>
+    <w:p>
+      <w:pPr>
+        <w:spacing w:line="360" w:lineRule="auto"/>
+        <w:jc w:val="both"/>
+        <w:rPr>
+          <w:szCs w:val="24"/>
+        </w:rPr>
+      </w:pPr>
+    </w:p>
+    <w:p>
+      <w:pPr>
+        <w:spacing w:line="360" w:lineRule="auto"/>
+        <w:jc w:val="both"/>
+        <w:rPr>
+          <w:szCs w:val="24"/>
+        </w:rPr>
+      </w:pPr>
+    </w:p>
+    <w:p>
+      <w:pPr>
+        <w:spacing w:line="360" w:lineRule="auto"/>
+        <w:jc w:val="both"/>
+        <w:rPr>
+          <w:szCs w:val="24"/>
+        </w:rPr>
+      </w:pPr>
+    </w:p>
+    <w:p>
+      <w:pPr>
+        <w:spacing w:line="360" w:lineRule="auto"/>
+        <w:jc w:val="both"/>
+        <w:rPr>
+          <w:szCs w:val="24"/>
+        </w:rPr>
+      </w:pPr>
+    </w:p>
+    <w:p>
+      <w:pPr>
+        <w:spacing w:line="360" w:lineRule="auto"/>
+        <w:jc w:val="both"/>
+        <w:rPr>
+          <w:szCs w:val="24"/>
+        </w:rPr>
+      </w:pPr>
+    </w:p>
+    <w:p>
+      <w:pPr>
+        <w:spacing w:line="360" w:lineRule="auto"/>
+        <w:jc w:val="both"/>
+        <w:rPr>
+          <w:szCs w:val="24"/>
+        </w:rPr>
+      </w:pPr>
+    </w:p>
+    <w:p>
+      <w:pPr>
+        <w:spacing w:line="360" w:lineRule="auto"/>
+        <w:jc w:val="both"/>
+        <w:rPr>
+          <w:szCs w:val="24"/>
+        </w:rPr>
+      </w:pPr>
+    </w:p>
+    <w:p>
+      <w:pPr>
+        <w:spacing w:line="360" w:lineRule="auto"/>
+        <w:jc w:val="both"/>
+        <w:rPr>
+          <w:szCs w:val="24"/>
+        </w:rPr>
+      </w:pPr>
+    </w:p>
+    <w:p>
+      <w:pPr>
+        <w:spacing w:line="360" w:lineRule="auto"/>
+        <w:jc w:val="both"/>
+        <w:rPr>
+          <w:szCs w:val="24"/>
+        </w:rPr>
+      </w:pPr>
+    </w:p>
+    <w:p>
+      <w:pPr>
+        <w:spacing w:line="360" w:lineRule="auto"/>
+        <w:jc w:val="both"/>
+        <w:rPr>
+          <w:szCs w:val="24"/>
+        </w:rPr>
+      </w:pPr>
+    </w:p>
+    <w:p>
+      <w:pPr>
+        <w:spacing w:line="360" w:lineRule="auto"/>
+        <w:jc w:val="both"/>
+        <w:rPr>
+          <w:szCs w:val="24"/>
+        </w:rPr>
+      </w:pPr>
+    </w:p>
+    <w:p>
+      <w:pPr>
+        <w:spacing w:line="360" w:lineRule="auto"/>
+        <w:jc w:val="both"/>
+        <w:rPr>
+          <w:szCs w:val="24"/>
+        </w:rPr>
+      </w:pPr>
+    </w:p>
+    <w:p>
+      <w:pPr>
+        <w:spacing w:line="360" w:lineRule="auto"/>
+        <w:jc w:val="both"/>
+        <w:rPr>
+          <w:szCs w:val="24"/>
+        </w:rPr>
+      </w:pPr>
+    </w:p>
+    <w:p>
+      <w:pPr>
+        <w:spacing w:line="360" w:lineRule="auto"/>
+        <w:jc w:val="both"/>
+        <w:rPr>
+          <w:b/>
+          <w:bCs/>
+          <w:szCs w:val="24"/>
+        </w:rPr>
+      </w:pPr>
+    </w:p>
+    <w:p>
+      <w:pPr>
+        <w:spacing w:line="360" w:lineRule="auto"/>
+        <w:jc w:val="both"/>
+        <w:rPr>
+          <w:b/>
+          <w:bCs/>
+          <w:szCs w:val="24"/>
+        </w:rPr>
+      </w:pPr>
+      <w:r>
+        <w:rPr>
+          <w:b/>
+          <w:bCs/>
+          <w:szCs w:val="24"/>
+        </w:rPr>
+        <w:t>10 MODELO DO BANCO DE DADOS</w:t>
+      </w:r>
+    </w:p>
+    <w:p>
+      <w:pPr>
+        <w:spacing w:line="360" w:lineRule="auto"/>
+        <w:jc w:val="both"/>
+        <w:rPr>
+          <w:szCs w:val="24"/>
+        </w:rPr>
+      </w:pPr>
+      <w:r>
+        <w:rPr>
+          <w:szCs w:val="24"/>
+        </w:rPr>
+        <w:tab/>
+      </w:r>
+      <w:r>
+        <w:rPr>
+          <w:szCs w:val="24"/>
+        </w:rPr>
+        <w:t>O banco de dados do SIGEPI foi projetado seguindo o modelo relacional e implementado em MySQL. O objetivo da modelagem foi garantir a integridade dos dados, a rastreabilidade das movimentações e o suporte eficiente às consultas realizadas pelo sistema. Um cuidado adotado em todo o modelo foi o uso do tipo ENUM nos campos de status e de tipo (situação de usuários, funcionários, EPIs, empresas, solicitações e entregas), que restringe os valores aceitos apenas aos previamente definidos, impedindo o registro de informações inválidas diretamente no banco — uma camada adicional de segurança e integridade.</w:t>
+      </w:r>
     </w:p>
     <w:p>
       <w:pPr>
@@ -14033,79 +15205,77 @@
         <w:rPr>
           <w:szCs w:val="24"/>
         </w:rPr>
-        <w:t xml:space="preserve">A interface do sistema foi construída com HTML, CSS e </w:t>
+        <w:t xml:space="preserve">As principais entidades do banco de dados são: empresas, usuários, funcionários, setores, EPIs, estoque, movimentações de estoque, entregas, </w:t>
+      </w:r>
+      <w:r>
+        <w:rPr>
+          <w:szCs w:val="24"/>
+        </w:rPr>
+        <w:lastRenderedPageBreak/>
+        <w:t>solicitações e logs de auditoria. Somam-se a elas tabelas auxiliares de apoio — cidade, endereço, categoria, tipo de usuário e o vínculo N:N entre EPIs e setores —, totalizando quinze tabelas. Cada entidade é representada por uma tabela, e os relacionamentos entre elas são estabelecidos por meio de chaves primárias e estrangeiras.</w:t>
+      </w:r>
+    </w:p>
+    <w:p>
+      <w:pPr>
+        <w:spacing w:line="360" w:lineRule="auto"/>
+        <w:ind w:firstLine="720"/>
+        <w:jc w:val="both"/>
+        <w:rPr>
+          <w:szCs w:val="24"/>
+        </w:rPr>
+      </w:pPr>
+      <w:r>
+        <w:rPr>
+          <w:szCs w:val="24"/>
+        </w:rPr>
+        <w:t>A tabela de empresas é o ponto central do modelo, pois todos os dados cadastrados no sistema pertencem a uma empresa específica. Isso permite que o SIGEPI seja utilizado por múltiplas empresas de forma isolada, sem que os dados de uma organização sejam visíveis para outra. A empresa possui ainda um código de acesso único, gerado automaticamente, utilizado pelos funcionários para se vincularem a ela.</w:t>
+      </w:r>
+    </w:p>
+    <w:p>
+      <w:pPr>
+        <w:spacing w:line="360" w:lineRule="auto"/>
+        <w:ind w:firstLine="720"/>
+        <w:jc w:val="both"/>
+        <w:rPr>
+          <w:szCs w:val="24"/>
+        </w:rPr>
+      </w:pPr>
+      <w:r>
+        <w:rPr>
+          <w:szCs w:val="24"/>
+        </w:rPr>
+        <w:t>A tabela de usuários armazena os dados de acesso — nome, e-mail, CPF, data de nascimento, senha criptografada e situação — e associa cada usuário a um perfil (administrador ou funcionário) por meio da tabela de tipos de usuário. O vínculo do usuário com uma empresa é opcional no momento do cadastro, o que permite que a conta exista antes de o usuário criar uma empresa (administrador) ou entrar em uma (funcionário, mediante o código de acesso). A tabela de funcionários complementa esses dados com nome, data de nascimento, setor de atuação e situação; quando um funcionário é inativado, o sistema registra também o motivo e a data da inativação, preservando o histórico por meio de exclusão lógica, sem apagar o registro.</w:t>
+      </w:r>
+    </w:p>
+    <w:p>
+      <w:pPr>
+        <w:spacing w:line="360" w:lineRule="auto"/>
+        <w:ind w:firstLine="720"/>
+        <w:jc w:val="both"/>
+        <w:rPr>
+          <w:szCs w:val="24"/>
+        </w:rPr>
+      </w:pPr>
+      <w:r>
+        <w:rPr>
+          <w:szCs w:val="24"/>
+        </w:rPr>
+        <w:t>Os EPIs são cadastrados em uma tabela própria, que contém nome, descrição, número e validade do Certificado de Aprovação (CA) e a categoria do equipamento. As categorias não são criadas pelo usuário: correspondem às oito categorias de proteção previstas na NR-6, inseridas previamente no banco. A validade do CA (</w:t>
       </w:r>
       <w:proofErr w:type="spellStart"/>
       <w:r>
         <w:rPr>
           <w:szCs w:val="24"/>
         </w:rPr>
-        <w:t>JavaScript</w:t>
+        <w:t>dt_validade_ca</w:t>
       </w:r>
       <w:proofErr w:type="spellEnd"/>
       <w:r>
         <w:rPr>
           <w:szCs w:val="24"/>
         </w:rPr>
-        <w:t xml:space="preserve"> puro. Essa combinação foi escolhida por ser a base do desenvolvimento web e por já ter sido trabalhada pela equipe durante o curso. O </w:t>
-      </w:r>
-      <w:proofErr w:type="spellStart"/>
-      <w:r>
-        <w:rPr>
-          <w:szCs w:val="24"/>
-        </w:rPr>
-        <w:t>JavaScript</w:t>
-      </w:r>
-      <w:proofErr w:type="spellEnd"/>
-      <w:r>
-        <w:rPr>
-          <w:szCs w:val="24"/>
-        </w:rPr>
-        <w:t xml:space="preserve"> foi utilizado para a manipulação dinâmica da interface e para a comunicação com a API do </w:t>
-      </w:r>
-      <w:proofErr w:type="spellStart"/>
-      <w:r>
-        <w:rPr>
-          <w:szCs w:val="24"/>
-        </w:rPr>
-        <w:t>back-end</w:t>
-      </w:r>
-      <w:proofErr w:type="spellEnd"/>
-      <w:r>
-        <w:rPr>
-          <w:szCs w:val="24"/>
-        </w:rPr>
-        <w:t xml:space="preserve"> por meio de requisições assíncronas.</w:t>
-      </w:r>
-    </w:p>
-    <w:p>
-      <w:pPr>
-        <w:spacing w:line="360" w:lineRule="auto"/>
-        <w:jc w:val="both"/>
-        <w:rPr>
-          <w:b/>
-          <w:bCs/>
-          <w:szCs w:val="24"/>
-        </w:rPr>
-      </w:pPr>
-      <w:r>
-        <w:rPr>
-          <w:b/>
-          <w:bCs/>
-          <w:szCs w:val="24"/>
-        </w:rPr>
-        <w:t>Back-</w:t>
-      </w:r>
-      <w:proofErr w:type="spellStart"/>
-      <w:r>
-        <w:rPr>
-          <w:b/>
-          <w:bCs/>
-          <w:szCs w:val="24"/>
-        </w:rPr>
-        <w:t>end</w:t>
-      </w:r>
-      <w:proofErr w:type="spellEnd"/>
+        <w:t>) é o campo que alimenta o cálculo de situação dos EPIs — regular, próximo do vencimento ou vencido — exibido nos filtros e no painel de dashboard.</w:t>
+      </w:r>
     </w:p>
     <w:p>
       <w:pPr>
@@ -14120,681 +15290,30 @@
         <w:rPr>
           <w:szCs w:val="24"/>
         </w:rPr>
-        <w:t xml:space="preserve">O </w:t>
-      </w:r>
-      <w:proofErr w:type="spellStart"/>
-      <w:r>
-        <w:rPr>
-          <w:szCs w:val="24"/>
-        </w:rPr>
-        <w:t>back-end</w:t>
-      </w:r>
-      <w:proofErr w:type="spellEnd"/>
-      <w:r>
-        <w:rPr>
-          <w:szCs w:val="24"/>
-        </w:rPr>
-        <w:t xml:space="preserve"> da aplicação foi desenvolvido com Node.js, plataforma que permite executar </w:t>
-      </w:r>
-      <w:proofErr w:type="spellStart"/>
-      <w:r>
-        <w:rPr>
-          <w:szCs w:val="24"/>
-        </w:rPr>
-        <w:t>JavaScript</w:t>
-      </w:r>
-      <w:proofErr w:type="spellEnd"/>
-      <w:r>
-        <w:rPr>
-          <w:szCs w:val="24"/>
-        </w:rPr>
-        <w:t xml:space="preserve"> no servidor, e com o framework Express.js, que simplifica a criação de APIs. O Express.js foi escolhido por sua leveza, flexibilidade e pela grande quantidade de bibliotecas disponíveis no ecossistema Node.js. Entre as bibliotecas utilizadas, destacam-se o </w:t>
-      </w:r>
-      <w:proofErr w:type="spellStart"/>
-      <w:r>
-        <w:rPr>
-          <w:szCs w:val="24"/>
-        </w:rPr>
-        <w:t>bcrypt</w:t>
-      </w:r>
-      <w:proofErr w:type="spellEnd"/>
-      <w:r>
-        <w:rPr>
-          <w:szCs w:val="24"/>
-        </w:rPr>
-        <w:t xml:space="preserve">, para a criptografia das senhas; o </w:t>
-      </w:r>
-      <w:proofErr w:type="spellStart"/>
-      <w:r>
-        <w:rPr>
-          <w:szCs w:val="24"/>
-        </w:rPr>
-        <w:t>jsonwebtoken</w:t>
-      </w:r>
-      <w:proofErr w:type="spellEnd"/>
-      <w:r>
-        <w:rPr>
-          <w:szCs w:val="24"/>
-        </w:rPr>
-        <w:t xml:space="preserve">, para a autenticação por meio de tokens JWT; e o </w:t>
-      </w:r>
-      <w:proofErr w:type="spellStart"/>
-      <w:r>
-        <w:rPr>
-          <w:szCs w:val="24"/>
-        </w:rPr>
-        <w:t>helmet</w:t>
-      </w:r>
-      <w:proofErr w:type="spellEnd"/>
-      <w:r>
-        <w:rPr>
-          <w:szCs w:val="24"/>
-        </w:rPr>
-        <w:t xml:space="preserve"> e o </w:t>
-      </w:r>
-      <w:proofErr w:type="spellStart"/>
-      <w:r>
-        <w:rPr>
-          <w:szCs w:val="24"/>
-        </w:rPr>
-        <w:t>express</w:t>
-      </w:r>
-      <w:proofErr w:type="spellEnd"/>
-      <w:r>
-        <w:rPr>
-          <w:szCs w:val="24"/>
-        </w:rPr>
-        <w:t>-rate-</w:t>
-      </w:r>
-      <w:proofErr w:type="spellStart"/>
-      <w:r>
-        <w:rPr>
-          <w:szCs w:val="24"/>
-        </w:rPr>
-        <w:t>limit</w:t>
-      </w:r>
-      <w:proofErr w:type="spellEnd"/>
-      <w:r>
-        <w:rPr>
-          <w:szCs w:val="24"/>
-        </w:rPr>
-        <w:t>, que reforçam a segurança da aplicação com cabeçalhos HTTP de proteção e limitação de tentativas de acesso.</w:t>
-      </w:r>
-    </w:p>
-    <w:p>
-      <w:pPr>
-        <w:spacing w:line="360" w:lineRule="auto"/>
-        <w:jc w:val="both"/>
-        <w:rPr>
-          <w:b/>
-          <w:bCs/>
-          <w:szCs w:val="24"/>
-        </w:rPr>
-      </w:pPr>
-      <w:r>
-        <w:rPr>
-          <w:b/>
-          <w:bCs/>
-          <w:szCs w:val="24"/>
-        </w:rPr>
-        <w:t>Banco de Dados</w:t>
-      </w:r>
-    </w:p>
-    <w:p>
-      <w:pPr>
-        <w:spacing w:line="360" w:lineRule="auto"/>
-        <w:jc w:val="both"/>
-        <w:rPr>
-          <w:szCs w:val="24"/>
-        </w:rPr>
-      </w:pPr>
-      <w:r>
-        <w:rPr>
-          <w:szCs w:val="24"/>
-        </w:rPr>
-        <w:tab/>
-      </w:r>
-      <w:r>
-        <w:rPr>
-          <w:szCs w:val="24"/>
-        </w:rPr>
-        <w:t>Para o armazenamento dos dados, foi utilizado o MySQL, um sistema de gerenciamento de banco de dados relacional. Sua escolha se justificou pela necessidade de manter a integridade referencial entre as tabelas do sistema, como a relação entre funcionários, EPIs e movimentações de estoque. O MySQL é uma tecnologia madura, amplamente adotada no mercado e com suporte nativo no ecossistema Node.js por meio de bibliotecas como o mysql2.</w:t>
-      </w:r>
-    </w:p>
-    <w:p>
-      <w:pPr>
-        <w:spacing w:line="360" w:lineRule="auto"/>
-        <w:jc w:val="both"/>
-        <w:rPr>
-          <w:b/>
-          <w:bCs/>
-          <w:szCs w:val="24"/>
-        </w:rPr>
-      </w:pPr>
-      <w:r>
-        <w:rPr>
-          <w:b/>
-          <w:bCs/>
-          <w:szCs w:val="24"/>
-        </w:rPr>
-        <w:t>Ferramentas de Desenvolvimento</w:t>
-      </w:r>
-    </w:p>
-    <w:p>
-      <w:pPr>
-        <w:spacing w:line="360" w:lineRule="auto"/>
-        <w:jc w:val="both"/>
-        <w:rPr>
-          <w:szCs w:val="24"/>
-        </w:rPr>
-      </w:pPr>
-      <w:r>
-        <w:rPr>
-          <w:szCs w:val="24"/>
-        </w:rPr>
-        <w:tab/>
-      </w:r>
-      <w:r>
-        <w:rPr>
-          <w:szCs w:val="24"/>
-        </w:rPr>
-        <w:t xml:space="preserve">Para o desenvolvimento do código, a equipe utilizou o Visual Studio </w:t>
-      </w:r>
-      <w:proofErr w:type="spellStart"/>
-      <w:r>
-        <w:rPr>
-          <w:szCs w:val="24"/>
-        </w:rPr>
-        <w:t>Code</w:t>
-      </w:r>
-      <w:proofErr w:type="spellEnd"/>
-      <w:r>
-        <w:rPr>
-          <w:szCs w:val="24"/>
-        </w:rPr>
-        <w:t xml:space="preserve">, editor gratuito e amplamente adotado na indústria. A prototipação das telas foi realizada no </w:t>
-      </w:r>
-      <w:proofErr w:type="spellStart"/>
-      <w:r>
-        <w:rPr>
-          <w:szCs w:val="24"/>
-        </w:rPr>
-        <w:t>Figma</w:t>
-      </w:r>
-      <w:proofErr w:type="spellEnd"/>
-      <w:r>
-        <w:rPr>
-          <w:szCs w:val="24"/>
-        </w:rPr>
-        <w:t xml:space="preserve">, que permitiu criar e validar as interfaces antes do desenvolvimento. Para os testes das rotas da API, foi utilizado o </w:t>
-      </w:r>
-      <w:proofErr w:type="spellStart"/>
-      <w:r>
-        <w:rPr>
-          <w:szCs w:val="24"/>
-        </w:rPr>
-        <w:t>Postman</w:t>
-      </w:r>
-      <w:proofErr w:type="spellEnd"/>
-      <w:r>
-        <w:rPr>
-          <w:szCs w:val="24"/>
-        </w:rPr>
-        <w:t xml:space="preserve">, ferramenta que facilita o envio de requisições HTTP e a verificação das respostas do servidor. O controle de versão do código foi feito com </w:t>
-      </w:r>
-      <w:proofErr w:type="spellStart"/>
-      <w:r>
-        <w:rPr>
-          <w:szCs w:val="24"/>
-        </w:rPr>
-        <w:t>Git</w:t>
-      </w:r>
-      <w:proofErr w:type="spellEnd"/>
-      <w:r>
-        <w:rPr>
-          <w:szCs w:val="24"/>
-        </w:rPr>
-        <w:t xml:space="preserve"> e GitHub.</w:t>
-      </w:r>
-    </w:p>
-    <w:p>
-      <w:pPr>
-        <w:spacing w:line="360" w:lineRule="auto"/>
-        <w:jc w:val="both"/>
-        <w:rPr>
-          <w:b/>
-          <w:bCs/>
-          <w:szCs w:val="24"/>
-        </w:rPr>
-      </w:pPr>
-      <w:r>
-        <w:rPr>
-          <w:b/>
-          <w:bCs/>
+        <w:t>O controle de estoque é feito por duas tabelas complementares: a de estoque, que mantém a quantidade disponível, a quantidade mínima e a validade de cada lote; e a de movimentações, que registra cada entrada ou saída de equipamento. A baixa de estoque segue a lógica FIFO (primeiro que entra, primeiro que sai), priorizando o lote de validade mais próxima, por meio de uma trigger que atualiza o estoque automaticamente a cada entrega registrada.</w:t>
+      </w:r>
+    </w:p>
+    <w:p>
+      <w:pPr>
+        <w:spacing w:line="360" w:lineRule="auto"/>
+        <w:ind w:firstLine="720"/>
+        <w:jc w:val="both"/>
+        <w:rPr>
+          <w:szCs w:val="24"/>
+        </w:rPr>
+      </w:pPr>
+      <w:r>
+        <w:rPr>
+          <w:szCs w:val="24"/>
+        </w:rPr>
+        <w:t xml:space="preserve">A tabela de entregas registra cada EPI entregue a um funcionário, com data de entrega, data de devolução (quando aplicável) e referência ao usuário que realizou o </w:t>
+      </w:r>
+      <w:r>
+        <w:rPr>
           <w:szCs w:val="24"/>
         </w:rPr>
         <w:lastRenderedPageBreak/>
-        <w:t>Progressive Web App (PWA)</w:t>
-      </w:r>
-    </w:p>
-    <w:p>
-      <w:pPr>
-        <w:spacing w:line="360" w:lineRule="auto"/>
-        <w:jc w:val="both"/>
-        <w:rPr>
-          <w:szCs w:val="24"/>
-        </w:rPr>
-      </w:pPr>
-      <w:r>
-        <w:rPr>
-          <w:szCs w:val="24"/>
-        </w:rPr>
-        <w:tab/>
-      </w:r>
-      <w:r>
-        <w:rPr>
-          <w:szCs w:val="24"/>
-        </w:rPr>
-        <w:t xml:space="preserve">Após a conclusão da versão web, o sistema será adaptado para funcionar como um Progressive Web App. Essa abordagem permitirá que o SIGEPI seja instalado em dispositivos móveis como se fosse um aplicativo nativo, sem a necessidade de publicação em lojas como Google Play ou App Store. O PWA utiliza recursos como Service Workers e Web App </w:t>
-      </w:r>
-      <w:proofErr w:type="spellStart"/>
-      <w:r>
-        <w:rPr>
-          <w:szCs w:val="24"/>
-        </w:rPr>
-        <w:t>Manifest</w:t>
-      </w:r>
-      <w:proofErr w:type="spellEnd"/>
-      <w:r>
-        <w:rPr>
-          <w:szCs w:val="24"/>
-        </w:rPr>
-        <w:t xml:space="preserve"> para oferecer uma experiência próxima à de um aplicativo móvel, mantendo a mesma base de código da versão web.</w:t>
-      </w:r>
-    </w:p>
-    <w:p>
-      <w:pPr>
-        <w:spacing w:line="360" w:lineRule="auto"/>
-        <w:jc w:val="both"/>
-        <w:rPr>
-          <w:b/>
-          <w:bCs/>
-          <w:szCs w:val="24"/>
-        </w:rPr>
-      </w:pPr>
-      <w:r>
-        <w:rPr>
-          <w:b/>
-          <w:bCs/>
-          <w:szCs w:val="24"/>
-        </w:rPr>
-        <w:t>Hospedagem</w:t>
-      </w:r>
-    </w:p>
-    <w:p>
-      <w:pPr>
-        <w:spacing w:line="360" w:lineRule="auto"/>
-        <w:jc w:val="both"/>
-        <w:rPr>
-          <w:b/>
-          <w:bCs/>
-          <w:szCs w:val="24"/>
-        </w:rPr>
-      </w:pPr>
-      <w:r>
-        <w:rPr>
-          <w:b/>
-          <w:bCs/>
-          <w:szCs w:val="24"/>
-        </w:rPr>
-        <w:tab/>
-      </w:r>
-      <w:r>
-        <w:rPr>
-          <w:szCs w:val="24"/>
-        </w:rPr>
-        <w:t>Para a disponibilização do sistema em ambiente de produção, adotou-se uma arquitetura de hospedagem dividida. O front-</w:t>
-      </w:r>
-      <w:proofErr w:type="spellStart"/>
-      <w:r>
-        <w:rPr>
-          <w:szCs w:val="24"/>
-        </w:rPr>
-        <w:t>end</w:t>
-      </w:r>
-      <w:proofErr w:type="spellEnd"/>
-      <w:r>
-        <w:rPr>
-          <w:szCs w:val="24"/>
-        </w:rPr>
-        <w:t xml:space="preserve">, composto por arquivos estáticos, foi publicado em plataforma de hospedagem de sites estáticos com certificado HTTPS automático. O </w:t>
-      </w:r>
-      <w:proofErr w:type="spellStart"/>
-      <w:r>
-        <w:rPr>
-          <w:szCs w:val="24"/>
-        </w:rPr>
-        <w:t>back-end</w:t>
-      </w:r>
-      <w:proofErr w:type="spellEnd"/>
-      <w:r>
-        <w:rPr>
-          <w:szCs w:val="24"/>
-        </w:rPr>
-        <w:t>, desenvolvido em Node.js, e o banco de dados MySQL foram hospedados em plataforma de aplicações que mantém o servidor em execução contínua, permitindo o acesso à API a qualquer momento. A adoção de HTTPS não é apenas uma exigência de segurança para o tráfego de credenciais: é também requisito técnico para o funcionamento do Progressive Web App, uma vez que os navegadores só permitem o registro de Service Workers em conexões seguras.</w:t>
-      </w:r>
-    </w:p>
-    <w:p>
-      <w:pPr>
-        <w:spacing w:line="360" w:lineRule="auto"/>
-        <w:jc w:val="both"/>
-        <w:rPr>
-          <w:szCs w:val="24"/>
-        </w:rPr>
-      </w:pPr>
-    </w:p>
-    <w:p>
-      <w:pPr>
-        <w:spacing w:line="360" w:lineRule="auto"/>
-        <w:jc w:val="both"/>
-        <w:rPr>
-          <w:szCs w:val="24"/>
-        </w:rPr>
-      </w:pPr>
-    </w:p>
-    <w:p>
-      <w:pPr>
-        <w:spacing w:line="360" w:lineRule="auto"/>
-        <w:jc w:val="both"/>
-        <w:rPr>
-          <w:szCs w:val="24"/>
-        </w:rPr>
-      </w:pPr>
-    </w:p>
-    <w:p>
-      <w:pPr>
-        <w:spacing w:line="360" w:lineRule="auto"/>
-        <w:jc w:val="both"/>
-        <w:rPr>
-          <w:szCs w:val="24"/>
-        </w:rPr>
-      </w:pPr>
-    </w:p>
-    <w:p>
-      <w:pPr>
-        <w:spacing w:line="360" w:lineRule="auto"/>
-        <w:jc w:val="both"/>
-        <w:rPr>
-          <w:szCs w:val="24"/>
-        </w:rPr>
-      </w:pPr>
-    </w:p>
-    <w:p>
-      <w:pPr>
-        <w:spacing w:line="360" w:lineRule="auto"/>
-        <w:jc w:val="both"/>
-        <w:rPr>
-          <w:szCs w:val="24"/>
-        </w:rPr>
-      </w:pPr>
-    </w:p>
-    <w:p>
-      <w:pPr>
-        <w:spacing w:line="360" w:lineRule="auto"/>
-        <w:jc w:val="both"/>
-        <w:rPr>
-          <w:szCs w:val="24"/>
-        </w:rPr>
-      </w:pPr>
-    </w:p>
-    <w:p>
-      <w:pPr>
-        <w:spacing w:line="360" w:lineRule="auto"/>
-        <w:jc w:val="both"/>
-        <w:rPr>
-          <w:szCs w:val="24"/>
-        </w:rPr>
-      </w:pPr>
-    </w:p>
-    <w:p>
-      <w:pPr>
-        <w:spacing w:line="360" w:lineRule="auto"/>
-        <w:jc w:val="both"/>
-        <w:rPr>
-          <w:szCs w:val="24"/>
-        </w:rPr>
-      </w:pPr>
-    </w:p>
-    <w:p>
-      <w:pPr>
-        <w:spacing w:line="360" w:lineRule="auto"/>
-        <w:jc w:val="both"/>
-        <w:rPr>
-          <w:szCs w:val="24"/>
-        </w:rPr>
-      </w:pPr>
-    </w:p>
-    <w:p>
-      <w:pPr>
-        <w:spacing w:line="360" w:lineRule="auto"/>
-        <w:jc w:val="both"/>
-        <w:rPr>
-          <w:szCs w:val="24"/>
-        </w:rPr>
-      </w:pPr>
-    </w:p>
-    <w:p>
-      <w:pPr>
-        <w:spacing w:line="360" w:lineRule="auto"/>
-        <w:jc w:val="both"/>
-        <w:rPr>
-          <w:szCs w:val="24"/>
-        </w:rPr>
-      </w:pPr>
-    </w:p>
-    <w:p>
-      <w:pPr>
-        <w:spacing w:line="360" w:lineRule="auto"/>
-        <w:jc w:val="both"/>
-        <w:rPr>
-          <w:szCs w:val="24"/>
-        </w:rPr>
-      </w:pPr>
-    </w:p>
-    <w:p>
-      <w:pPr>
-        <w:spacing w:line="360" w:lineRule="auto"/>
-        <w:jc w:val="both"/>
-        <w:rPr>
-          <w:szCs w:val="24"/>
-        </w:rPr>
-      </w:pPr>
-    </w:p>
-    <w:p>
-      <w:pPr>
-        <w:spacing w:line="360" w:lineRule="auto"/>
-        <w:jc w:val="both"/>
-        <w:rPr>
-          <w:szCs w:val="24"/>
-        </w:rPr>
-      </w:pPr>
-    </w:p>
-    <w:p>
-      <w:pPr>
-        <w:spacing w:line="360" w:lineRule="auto"/>
-        <w:jc w:val="both"/>
-        <w:rPr>
-          <w:szCs w:val="24"/>
-        </w:rPr>
-      </w:pPr>
-    </w:p>
-    <w:p>
-      <w:pPr>
-        <w:spacing w:line="360" w:lineRule="auto"/>
-        <w:jc w:val="both"/>
-        <w:rPr>
-          <w:b/>
-          <w:bCs/>
-          <w:szCs w:val="24"/>
-        </w:rPr>
-      </w:pPr>
-    </w:p>
-    <w:p>
-      <w:pPr>
-        <w:spacing w:line="360" w:lineRule="auto"/>
-        <w:jc w:val="both"/>
-        <w:rPr>
-          <w:b/>
-          <w:bCs/>
-          <w:szCs w:val="24"/>
-        </w:rPr>
-      </w:pPr>
-      <w:r>
-        <w:rPr>
-          <w:b/>
-          <w:bCs/>
-          <w:szCs w:val="24"/>
-        </w:rPr>
-        <w:lastRenderedPageBreak/>
-        <w:t>10 MODELO DO BANCO DE DADOS</w:t>
-      </w:r>
-    </w:p>
-    <w:p>
-      <w:pPr>
-        <w:spacing w:line="360" w:lineRule="auto"/>
-        <w:jc w:val="both"/>
-        <w:rPr>
-          <w:szCs w:val="24"/>
-        </w:rPr>
-      </w:pPr>
-      <w:r>
-        <w:rPr>
-          <w:szCs w:val="24"/>
-        </w:rPr>
-        <w:tab/>
-      </w:r>
-      <w:r>
-        <w:rPr>
-          <w:szCs w:val="24"/>
-        </w:rPr>
-        <w:t>O banco de dados do SIGEPI foi projetado seguindo o modelo relacional e implementado em MySQL. O objetivo da modelagem foi garantir a integridade dos dados, a rastreabilidade das movimentações e o suporte eficiente às consultas realizadas pelo sistema. Um cuidado adotado em todo o modelo foi o uso do tipo ENUM nos campos de status e de tipo (situação de usuários, funcionários, EPIs, empresas, solicitações e entregas), que restringe os valores aceitos apenas aos previamente definidos, impedindo o registro de informações inválidas diretamente no banco — uma camada adicional de segurança e integridade.</w:t>
-      </w:r>
-    </w:p>
-    <w:p>
-      <w:pPr>
-        <w:spacing w:line="360" w:lineRule="auto"/>
-        <w:ind w:firstLine="720"/>
-        <w:jc w:val="both"/>
-        <w:rPr>
-          <w:szCs w:val="24"/>
-        </w:rPr>
-      </w:pPr>
-      <w:r>
-        <w:rPr>
-          <w:szCs w:val="24"/>
-        </w:rPr>
-        <w:t>As principais entidades do banco de dados são: empresas, usuários, funcionários, setores, EPIs, estoque, movimentações de estoque, entregas, solicitações e logs de auditoria. Somam-se a elas tabelas auxiliares de apoio — cidade, endereço, categoria, tipo de usuário e o vínculo N:N entre EPIs e setores —, totalizando quinze tabelas. Cada entidade é representada por uma tabela, e os relacionamentos entre elas são estabelecidos por meio de chaves primárias e estrangeiras.</w:t>
-      </w:r>
-    </w:p>
-    <w:p>
-      <w:pPr>
-        <w:spacing w:line="360" w:lineRule="auto"/>
-        <w:ind w:firstLine="720"/>
-        <w:jc w:val="both"/>
-        <w:rPr>
-          <w:szCs w:val="24"/>
-        </w:rPr>
-      </w:pPr>
-      <w:r>
-        <w:rPr>
-          <w:szCs w:val="24"/>
-        </w:rPr>
-        <w:t>A tabela de empresas é o ponto central do modelo, pois todos os dados cadastrados no sistema pertencem a uma empresa específica. Isso permite que o SIGEPI seja utilizado por múltiplas empresas de forma isolada, sem que os dados de uma organização sejam visíveis para outra. A empresa possui ainda um código de acesso único, gerado automaticamente, utilizado pelos funcionários para se vincularem a ela.</w:t>
-      </w:r>
-    </w:p>
-    <w:p>
-      <w:pPr>
-        <w:spacing w:line="360" w:lineRule="auto"/>
-        <w:ind w:firstLine="720"/>
-        <w:jc w:val="both"/>
-        <w:rPr>
-          <w:szCs w:val="24"/>
-        </w:rPr>
-      </w:pPr>
-      <w:r>
-        <w:rPr>
-          <w:szCs w:val="24"/>
-        </w:rPr>
-        <w:t>A tabela de usuários armazena os dados de acesso — nome, e-mail, CPF, data de nascimento, senha criptografada e situação — e associa cada usuário a um perfil (administrador ou funcionário) por meio da tabela de tipos de usuário. O vínculo do usuário com uma empresa é opcional no momento do cadastro, o que permite que a conta exista antes de o usuário criar uma empresa (administrador) ou entrar em uma (funcionário, mediante o código de acesso). A tabela de funcionários complementa esses dados com nome, data de nascimento, setor de atuação e situação; quando um funcionário é inativado, o sistema registra também o motivo e a data da inativação, preservando o histórico por meio de exclusão lógica, sem apagar o registro.</w:t>
-      </w:r>
-    </w:p>
-    <w:p>
-      <w:pPr>
-        <w:spacing w:line="360" w:lineRule="auto"/>
-        <w:ind w:firstLine="720"/>
-        <w:jc w:val="both"/>
-        <w:rPr>
-          <w:szCs w:val="24"/>
-        </w:rPr>
-      </w:pPr>
-      <w:r>
-        <w:rPr>
-          <w:szCs w:val="24"/>
-        </w:rPr>
-        <w:t xml:space="preserve">Os EPIs são cadastrados em uma tabela própria, que contém nome, descrição, número e validade do Certificado de Aprovação (CA) e a categoria do equipamento. As categorias não são criadas pelo usuário: correspondem às oito categorias de </w:t>
-      </w:r>
-      <w:r>
-        <w:rPr>
-          <w:szCs w:val="24"/>
-        </w:rPr>
-        <w:lastRenderedPageBreak/>
-        <w:t>proteção previstas na NR-6, inseridas previamente no banco. A validade do CA (</w:t>
-      </w:r>
-      <w:proofErr w:type="spellStart"/>
-      <w:r>
-        <w:rPr>
-          <w:szCs w:val="24"/>
-        </w:rPr>
-        <w:t>dt_validade_ca</w:t>
-      </w:r>
-      <w:proofErr w:type="spellEnd"/>
-      <w:r>
-        <w:rPr>
-          <w:szCs w:val="24"/>
-        </w:rPr>
-        <w:t>) é o campo que alimenta o cálculo de situação dos EPIs — regular, próximo do vencimento ou vencido — exibido nos filtros e no painel de dashboard.</w:t>
-      </w:r>
-    </w:p>
-    <w:p>
-      <w:pPr>
-        <w:spacing w:line="360" w:lineRule="auto"/>
-        <w:ind w:firstLine="720"/>
-        <w:jc w:val="both"/>
-        <w:rPr>
-          <w:szCs w:val="24"/>
-        </w:rPr>
-      </w:pPr>
-      <w:r>
-        <w:rPr>
-          <w:szCs w:val="24"/>
-        </w:rPr>
-        <w:t>O controle de estoque é feito por duas tabelas complementares: a de estoque, que mantém a quantidade disponível, a quantidade mínima e a validade de cada lote; e a de movimentações, que registra cada entrada ou saída de equipamento. A baixa de estoque segue a lógica FIFO (primeiro que entra, primeiro que sai), priorizando o lote de validade mais próxima, por meio de uma trigger que atualiza o estoque automaticamente a cada entrega registrada.</w:t>
-      </w:r>
-    </w:p>
-    <w:p>
-      <w:pPr>
-        <w:spacing w:line="360" w:lineRule="auto"/>
-        <w:ind w:firstLine="720"/>
-        <w:jc w:val="both"/>
-        <w:rPr>
-          <w:szCs w:val="24"/>
-        </w:rPr>
-      </w:pPr>
-      <w:r>
-        <w:rPr>
-          <w:szCs w:val="24"/>
-        </w:rPr>
-        <w:t>A tabela de entregas registra cada EPI entregue a um funcionário, com data de entrega, data de devolução (quando aplicável) e referência ao usuário que realizou o registro. Cada entrega possui uma situação (pendente, aceita, devolvida ou recusada): o funcionário deve confirmar ou recusar o recebimento do equipamento — registrando, na recusa, a data e o motivo —, o que atende à exigência de comprovação de entrega prevista na NR-6.</w:t>
+        <w:t>registro. Cada entrega possui uma situação (pendente, aceita, devolvida ou recusada): o funcionário deve confirmar ou recusar o recebimento do equipamento — registrando, na recusa, a data e o motivo —, o que atende à exigência de comprovação de entrega prevista na NR-6.</w:t>
       </w:r>
       <w:r>
         <w:rPr>
@@ -18098,7 +18617,6 @@
   <w:style w:type="character" w:default="1" w:styleId="Fontepargpadro">
     <w:name w:val="Default Paragraph Font"/>
     <w:uiPriority w:val="1"/>
-    <w:semiHidden/>
     <w:unhideWhenUsed/>
   </w:style>
   <w:style w:type="table" w:default="1" w:styleId="Tabelanormal">

</xml_diff>